<commit_message>
docs(aan): Draft Proposal framing, SASE stack, InfoBlox trust architecture, table formatting, NAC/DNS/cert bridges
- All 20 books: Draft Proposal callout (CSI Team, pending SSA CIO Office + OIS review)
- Book_00: About This Document preamble; vendor disclaimer callout; SASE/SD-WAN product names in layer bullets; InfoBlox claim softened; Closure Necessity caveat
- Book_01: Grid Master on-prem VMware trust rationale; least-privilege role delegation; lz-fig-18/19/20 diagrams; DNS Traffic Steering diagram in Section 6; InfoBlox two-path procurement; NAC/DNS/cert bridge
- Book_02: NAC/DNS/cert cross-book bridge callout
- Book_03: NAC/DNS/cert gap callout; OIS validation note
- Book_06: SD-WAN and SASE Stack Architecture section with component table
- lz-style.css: full table cell borders; top-left text alignment enforced
</commit_message>
<xml_diff>
--- a/inbox/Application Aware Networking/Book_01_FedAAN_SSA_Landing_Zone_IPAM_FedRAMP.docx
+++ b/inbox/Application Aware Networking/Book_01_FedAAN_SSA_Landing_Zone_IPAM_FedRAMP.docx
@@ -60,312 +60,15 @@
         </w:p>
       </w:sdtContent>
     </w:sdt>
-    <w:p>
-      <w:r>
-        <w:pict>
-          <v:rect style="width:0;height:1.5pt" o:hralign="center" o:hrstd="t" o:hr="t"/>
-        </w:pict>
-      </w:r>
-    </w:p>
-    <w:bookmarkStart w:id="9" w:name="executive-summary"/>
-    <w:p>
-      <w:pPr>
-        <w:pStyle w:val="Heading2"/>
-      </w:pPr>
-      <w:r>
-        <w:t xml:space="preserve">Executive Summary</w:t>
-      </w:r>
-    </w:p>
-    <w:p>
-      <w:pPr>
-        <w:pStyle w:val="FirstParagraph"/>
-      </w:pPr>
-      <w:r>
-        <w:t xml:space="preserve">The Social Security Administration operates four distinct cloud environments — on-premises VMware Cloud Foundation, Microsoft Azure Government (GCC Moderate), AWS GovCloud, and Oracle Cloud Infrastructure (OCI) for OPM HRIT integration. Each environment uses a different Software Defined Networking fabric that replaces traditional broadcast DHCP with fabric-native IP assignment. Without a unified control layer, SSA has no cross-environment IP visibility, no unified DNS security policy, no automated certificate lifecycle, and must collect FedRAMP compliance evidence from four separate sources.</w:t>
-      </w:r>
-    </w:p>
-    <w:p>
-      <w:pPr>
-        <w:pStyle w:val="BodyText"/>
-      </w:pPr>
-      <w:r>
-        <w:rPr>
-          <w:b/>
-          <w:bCs/>
-        </w:rPr>
-        <w:t xml:space="preserve">InfoBlox DDI</w:t>
-      </w:r>
-      <w:r>
-        <w:t xml:space="preserve"> </w:t>
-      </w:r>
-      <w:r>
-        <w:t xml:space="preserve">— the market-leading platform for DNS, DHCP, and IP Address Management — solves all four problems from a single FedRAMP-authorized control plane (CSO FR2017257053, authorized January 2023, hosted on AWS GovCloud).</w:t>
-      </w:r>
-    </w:p>
-    <w:p>
-      <w:pPr>
-        <w:pStyle w:val="BodyText"/>
-      </w:pPr>
-      <w:r>
-        <w:rPr>
-          <w:b/>
-          <w:bCs/>
-        </w:rPr>
-        <w:t xml:space="preserve">The three business outcomes this document demonstrates:</w:t>
-      </w:r>
-    </w:p>
-    <w:p>
-      <w:pPr>
-        <w:pStyle w:val="BodyText"/>
-      </w:pPr>
-      <w:r>
-        <w:rPr>
-          <w:b/>
-          <w:bCs/>
-        </w:rPr>
-        <w:t xml:space="preserve">1. Operational Risk Elimination.</w:t>
-      </w:r>
-      <w:r>
-        <w:t xml:space="preserve"> </w:t>
-      </w:r>
-      <w:r>
-        <w:t xml:space="preserve">A single Infoblox deployment replaces four separate DNS systems, four separate IP inventory processes, and four separate certificate-tracking tools. When a new cloud workload spins up in any environment, Infoblox automatically allocates an IP (cross-cloud conflict checked), creates DNS A and PTR records, and enrolls a machine certificate via SCEP — in seconds, without a change ticket. When a workload decommissions, all three are revoked atomically.</w:t>
-      </w:r>
-    </w:p>
-    <w:p>
-      <w:pPr>
-        <w:pStyle w:val="BodyText"/>
-      </w:pPr>
-      <w:r>
-        <w:rPr>
-          <w:b/>
-          <w:bCs/>
-        </w:rPr>
-        <w:t xml:space="preserve">2. Continuous FedRAMP Compliance.</w:t>
-      </w:r>
-      <w:r>
-        <w:t xml:space="preserve"> </w:t>
-      </w:r>
-      <w:r>
-        <w:t xml:space="preserve">Infoblox is the only DDI platform with its own FedRAMP Moderate CSO authorization, meaning SSA inherits the DDI layer controls rather than re-proving them. Evidence for SC-20/21 (DNSSEC), CM-8 (inventory), IA-5(2) (certificates), AU-12 (audit), and IR-4 (incident response) is generated continuously and automatically — not assembled manually for annual assessments.</w:t>
-      </w:r>
-    </w:p>
-    <w:p>
-      <w:pPr>
-        <w:pStyle w:val="BodyText"/>
-      </w:pPr>
-      <w:r>
-        <w:rPr>
-          <w:b/>
-          <w:bCs/>
-        </w:rPr>
-        <w:t xml:space="preserve">3. M365 GCC Boundary Enforcement.</w:t>
-      </w:r>
-      <w:r>
-        <w:t xml:space="preserve"> </w:t>
-      </w:r>
-      <w:r>
-        <w:t xml:space="preserve">Microsoft publishes M365 GCC endpoint changes up to 12 times per year. Without automation, each change requires four manual updates across NSG rules, VPC security groups, RPZ policies, and VPN split-tunnel configurations — during which a gap exists between when Microsoft changes an endpoint and when SSA’s controls reflect it. Infoblox polls the Microsoft 365 IP &amp; URL Web Service API daily and pushes all four enforcement updates simultaneously, closing the boundary gap window to minutes.</w:t>
-      </w:r>
-    </w:p>
-    <w:p>
-      <w:pPr>
-        <w:pStyle w:val="BodyText"/>
-      </w:pPr>
-      <w:r>
-        <w:rPr>
-          <w:b/>
-          <w:bCs/>
-        </w:rPr>
-        <w:t xml:space="preserve">Vendor relationships:</w:t>
-      </w:r>
-      <w:r>
-        <w:t xml:space="preserve"> </w:t>
-      </w:r>
-      <w:r>
-        <w:t xml:space="preserve">InfoBlox has formal technology partnerships with all three of SSA’s primary cloud vendors. InfoBlox BloxOne’s own FedRAMP-authorized service runs</w:t>
-      </w:r>
-      <w:r>
-        <w:t xml:space="preserve"> </w:t>
-      </w:r>
-      <w:r>
-        <w:rPr>
-          <w:i/>
-          <w:iCs/>
-        </w:rPr>
-        <w:t xml:space="preserve">on</w:t>
-      </w:r>
-      <w:r>
-        <w:t xml:space="preserve"> </w:t>
-      </w:r>
-      <w:r>
-        <w:t xml:space="preserve">AWS GovCloud, making AWS the infrastructure foundation. InfoBlox is a Microsoft Azure Technology Alliance Partner with native Microsoft Sentinel, Defender Threat Intelligence, and Entra ID integrations. InfoBlox is available on the Oracle Cloud Marketplace with OCI connector support for the OPM HRIT integration path.</w:t>
-      </w:r>
-    </w:p>
-    <w:p>
-      <w:pPr>
-        <w:pStyle w:val="BodyText"/>
-      </w:pPr>
-      <w:r>
-        <w:rPr>
-          <w:b/>
-          <w:bCs/>
-        </w:rPr>
-        <w:t xml:space="preserve">The recommendation is clear: procure InfoBlox DDI via the AWS GovCloud Marketplace</w:t>
-      </w:r>
-      <w:r>
-        <w:t xml:space="preserve"> </w:t>
-      </w:r>
-      <w:r>
-        <w:t xml:space="preserve">(no separate IDIQ required), deploy Grid Members in each environment, and build the landing zone DNS and IPAM layer on InfoBlox from day one. Every workload deployed after that point inherits FedRAMP-compliant DNS, IP management, and certificate lifecycle automatically.</w:t>
-      </w:r>
-    </w:p>
-    <w:p>
-      <w:r>
-        <w:pict>
-          <v:rect style="width:0;height:1.5pt" o:hralign="center" o:hrstd="t" o:hr="t"/>
-        </w:pict>
-      </w:r>
-    </w:p>
-    <w:bookmarkEnd w:id="9"/>
-    <w:bookmarkStart w:id="25" w:name="sec-landing-zone"/>
-    <w:p>
-      <w:pPr>
-        <w:pStyle w:val="Heading2"/>
-      </w:pPr>
-      <w:r>
-        <w:t xml:space="preserve">1 What Is a Federal Cloud Landing Zone?</w:t>
-      </w:r>
-    </w:p>
-    <w:p>
-      <w:pPr>
-        <w:pStyle w:val="FirstParagraph"/>
-      </w:pPr>
-      <w:r>
-        <w:t xml:space="preserve">A Cloud Landing Zone is the foundational, pre-configured environment that a federal agency provisions</w:t>
-      </w:r>
-      <w:r>
-        <w:t xml:space="preserve"> </w:t>
-      </w:r>
-      <w:r>
-        <w:rPr>
-          <w:i/>
-          <w:iCs/>
-        </w:rPr>
-        <w:t xml:space="preserve">before</w:t>
-      </w:r>
-      <w:r>
-        <w:t xml:space="preserve"> </w:t>
-      </w:r>
-      <w:r>
-        <w:t xml:space="preserve">any workload is deployed. It establishes the guardrails — network topology, identity controls, logging pipelines, encryption policies, and security baselines — that every subsequent workload inherits automatically.</w:t>
-      </w:r>
-    </w:p>
-    <w:p>
-      <w:pPr>
-        <w:pStyle w:val="BodyText"/>
-      </w:pPr>
-      <w:r>
-        <w:t xml:space="preserve">For SSA operating under FedRAMP Moderate, the landing zone must satisfy four overlapping frameworks simultaneously:</w:t>
-      </w:r>
-    </w:p>
-    <w:p>
-      <w:pPr>
-        <w:pStyle w:val="Compact"/>
-        <w:numPr>
-          <w:ilvl w:val="0"/>
-          <w:numId w:val="1001"/>
-        </w:numPr>
-      </w:pPr>
-      <w:r>
-        <w:rPr>
-          <w:b/>
-          <w:bCs/>
-        </w:rPr>
-        <w:t xml:space="preserve">NIST SP 800-53 Rev 5</w:t>
-      </w:r>
-      <w:r>
-        <w:t xml:space="preserve"> </w:t>
-      </w:r>
-      <w:r>
-        <w:t xml:space="preserve">— the control catalog from which FedRAMP Moderate baselines are drawn</w:t>
-      </w:r>
-    </w:p>
-    <w:p>
-      <w:pPr>
-        <w:pStyle w:val="Compact"/>
-        <w:numPr>
-          <w:ilvl w:val="0"/>
-          <w:numId w:val="1001"/>
-        </w:numPr>
-      </w:pPr>
-      <w:r>
-        <w:rPr>
-          <w:b/>
-          <w:bCs/>
-        </w:rPr>
-        <w:t xml:space="preserve">CISA Zero Trust Maturity Model v2.0</w:t>
-      </w:r>
-      <w:r>
-        <w:t xml:space="preserve"> </w:t>
-      </w:r>
-      <w:r>
-        <w:t xml:space="preserve">— five pillars with three cross-cutting capabilities</w:t>
-      </w:r>
-    </w:p>
-    <w:p>
-      <w:pPr>
-        <w:pStyle w:val="Compact"/>
-        <w:numPr>
-          <w:ilvl w:val="0"/>
-          <w:numId w:val="1001"/>
-        </w:numPr>
-      </w:pPr>
-      <w:r>
-        <w:rPr>
-          <w:b/>
-          <w:bCs/>
-        </w:rPr>
-        <w:t xml:space="preserve">FedRAMP Moderate</w:t>
-      </w:r>
-      <w:r>
-        <w:t xml:space="preserve"> </w:t>
-      </w:r>
-      <w:r>
-        <w:t xml:space="preserve">— boundary definition, continuous monitoring, evidence packaging</w:t>
-      </w:r>
-    </w:p>
-    <w:p>
-      <w:pPr>
-        <w:pStyle w:val="Compact"/>
-        <w:numPr>
-          <w:ilvl w:val="0"/>
-          <w:numId w:val="1001"/>
-        </w:numPr>
-      </w:pPr>
-      <w:r>
-        <w:rPr>
-          <w:b/>
-          <w:bCs/>
-        </w:rPr>
-        <w:t xml:space="preserve">FedRAMP 20x Consolidated Rules (2026)</w:t>
-      </w:r>
-      <w:r>
-        <w:t xml:space="preserve"> </w:t>
-      </w:r>
-      <w:r>
-        <w:t xml:space="preserve">— automated, machine-readable compliance evidence enforced by infrastructure-as-code; Class A/B/C certification pipelines; mandatory January 1, 2027</w:t>
-      </w:r>
-    </w:p>
     <w:tbl>
       <w:tblPr>
         <w:tblStyle w:val="Table"/>
         <w:tblLook w:firstRow="0" w:lastRow="0" w:firstColumn="0" w:lastColumn="0" w:noHBand="0" w:noVBand="0" w:val="0000"/>
         <w:tblBorders>
-          <w:top w:val="single" w:sz="4" w:space="0" w:color="CC1914"/>
-          <w:left w:val="single" w:sz="24" w:space="0" w:color="CC1914"/>
-          <w:bottom w:val="single" w:sz="4" w:space="0" w:color="CC1914"/>
-          <w:right w:val="single" w:sz="4" w:space="0" w:color="CC1914"/>
+          <w:top w:val="single" w:sz="4" w:space="0" w:color="EB9113"/>
+          <w:left w:val="single" w:sz="24" w:space="0" w:color="EB9113"/>
+          <w:bottom w:val="single" w:sz="4" w:space="0" w:color="EB9113"/>
+          <w:right w:val="single" w:sz="4" w:space="0" w:color="EB9113"/>
         </w:tblBorders>
         <w:tblCellMar>
           <w:left w:w="144" w:type="dxa"/>
@@ -379,7 +82,7 @@
         </w:trPr>
         <w:tc>
           <w:tcPr>
-            <w:shd w:color="auto" w:fill="f7dddc" w:val="clear"/>
+            <w:shd w:color="auto" w:fill="fcefdc" w:val="clear"/>
             <w:tcMar>
               <w:top w:w="92" w:type="dxa"/>
               <w:bottom w:w="92" w:type="dxa"/>
@@ -398,18 +101,18 @@
                 <wp:inline>
                   <wp:extent cx="152400" cy="152400"/>
                   <wp:effectExtent b="0" l="0" r="0" t="0"/>
-                  <wp:docPr descr="" title="" id="11" name="Picture"/>
+                  <wp:docPr descr="" title="" id="10" name="Picture"/>
                   <a:graphic>
                     <a:graphicData uri="http://schemas.openxmlformats.org/drawingml/2006/picture">
                       <pic:pic>
                         <pic:nvPicPr>
-                          <pic:cNvPr descr="/opt/quarto/share/formats/docx/important.png" id="12" name="Picture"/>
+                          <pic:cNvPr descr="/opt/quarto/share/formats/docx/warning.png" id="11" name="Picture"/>
                           <pic:cNvPicPr>
                             <a:picLocks noChangeArrowheads="1" noChangeAspect="1"/>
                           </pic:cNvPicPr>
                         </pic:nvPicPr>
                         <pic:blipFill>
-                          <a:blip r:embed="rId10"/>
+                          <a:blip r:embed="rId9"/>
                           <a:stretch>
                             <a:fillRect/>
                           </a:stretch>
@@ -442,7 +145,7 @@
               <w:t xml:space="preserve"> </w:t>
             </w:r>
             <w:r>
-              <w:t xml:space="preserve">Important</w:t>
+              <w:t xml:space="preserve">Draft Proposal — Subject to Review</w:t>
             </w:r>
           </w:p>
         </w:tc>
@@ -466,6 +169,496 @@
               <w:spacing w:before="16" w:after="16"/>
             </w:pPr>
             <w:r>
+              <w:t xml:space="preserve">This document is a</w:t>
+            </w:r>
+            <w:r>
+              <w:t xml:space="preserve"> </w:t>
+            </w:r>
+            <w:r>
+              <w:rPr>
+                <w:b/>
+                <w:bCs/>
+              </w:rPr>
+              <w:t xml:space="preserve">draft proposal</w:t>
+            </w:r>
+            <w:r>
+              <w:t xml:space="preserve"> </w:t>
+            </w:r>
+            <w:r>
+              <w:t xml:space="preserve">developed by the</w:t>
+            </w:r>
+            <w:r>
+              <w:t xml:space="preserve"> </w:t>
+            </w:r>
+            <w:r>
+              <w:rPr>
+                <w:b/>
+                <w:bCs/>
+              </w:rPr>
+              <w:t xml:space="preserve">CSI Team (Cloud Services Infrastructure)</w:t>
+            </w:r>
+            <w:r>
+              <w:t xml:space="preserve">. It is an attempt at a comprehensive SSA-wide technical roadmap and has not been reviewed or approved by the SSA CIO Office, the Office of Information Security (OIS), or organizational leadership. All recommendations, vendor selections, control mappings, and implementation timelines are subject to revision pending formal review by the SSA CIO Office and organizational components.</w:t>
+            </w:r>
+          </w:p>
+          <w:p/>
+        </w:tc>
+      </w:tr>
+    </w:tbl>
+    <w:p>
+      <w:r>
+        <w:pict>
+          <v:rect style="width:0;height:1.5pt" o:hralign="center" o:hrstd="t" o:hr="t"/>
+        </w:pict>
+      </w:r>
+    </w:p>
+    <w:bookmarkStart w:id="12" w:name="executive-summary"/>
+    <w:p>
+      <w:pPr>
+        <w:pStyle w:val="Heading2"/>
+      </w:pPr>
+      <w:r>
+        <w:t xml:space="preserve">Executive Summary</w:t>
+      </w:r>
+    </w:p>
+    <w:p>
+      <w:pPr>
+        <w:pStyle w:val="FirstParagraph"/>
+      </w:pPr>
+      <w:r>
+        <w:t xml:space="preserve">The Social Security Administration operates four distinct cloud environments — on-premises VMware Cloud Foundation, Microsoft Azure Government (GCC Moderate), AWS GovCloud, and Oracle Cloud Infrastructure (OCI) for OPM HRIT integration. Each environment uses a different Software Defined Networking fabric that replaces traditional broadcast DHCP with fabric-native IP assignment. Without a unified control layer, SSA has no cross-environment IP visibility, no unified DNS security policy, no automated certificate lifecycle, and must collect FedRAMP compliance evidence from four separate sources.</w:t>
+      </w:r>
+    </w:p>
+    <w:p>
+      <w:pPr>
+        <w:pStyle w:val="BodyText"/>
+      </w:pPr>
+      <w:r>
+        <w:rPr>
+          <w:b/>
+          <w:bCs/>
+        </w:rPr>
+        <w:t xml:space="preserve">InfoBlox DDI</w:t>
+      </w:r>
+      <w:r>
+        <w:t xml:space="preserve"> </w:t>
+      </w:r>
+      <w:r>
+        <w:t xml:space="preserve">— the market-leading platform for DNS, DHCP, and IP Address Management — solves all four problems from a single FedRAMP-authorized control plane (CSO FR2017257053, authorized January 2023, hosted on AWS GovCloud).</w:t>
+      </w:r>
+    </w:p>
+    <w:p>
+      <w:pPr>
+        <w:pStyle w:val="BodyText"/>
+      </w:pPr>
+      <w:r>
+        <w:rPr>
+          <w:b/>
+          <w:bCs/>
+        </w:rPr>
+        <w:t xml:space="preserve">The three business outcomes this document demonstrates:</w:t>
+      </w:r>
+    </w:p>
+    <w:p>
+      <w:pPr>
+        <w:pStyle w:val="BodyText"/>
+      </w:pPr>
+      <w:r>
+        <w:rPr>
+          <w:b/>
+          <w:bCs/>
+        </w:rPr>
+        <w:t xml:space="preserve">1. Operational Risk Elimination.</w:t>
+      </w:r>
+      <w:r>
+        <w:t xml:space="preserve"> </w:t>
+      </w:r>
+      <w:r>
+        <w:t xml:space="preserve">A single Infoblox deployment replaces four separate DNS systems, four separate IP inventory processes, and four separate certificate-tracking tools. When a new cloud workload spins up in any environment, Infoblox automatically allocates an IP (cross-cloud conflict checked), creates DNS A and PTR records, and enrolls a machine certificate via SCEP — in seconds, without a change ticket. When a workload decommissions, all three are revoked atomically.</w:t>
+      </w:r>
+    </w:p>
+    <w:p>
+      <w:pPr>
+        <w:pStyle w:val="BodyText"/>
+      </w:pPr>
+      <w:r>
+        <w:rPr>
+          <w:b/>
+          <w:bCs/>
+        </w:rPr>
+        <w:t xml:space="preserve">2. Continuous FedRAMP Compliance.</w:t>
+      </w:r>
+      <w:r>
+        <w:t xml:space="preserve"> </w:t>
+      </w:r>
+      <w:r>
+        <w:t xml:space="preserve">Infoblox is one of a small number of DDI platforms with its own FedRAMP Moderate CSO authorization; verify current authorization on the FedRAMP Marketplace at time of procurement, meaning SSA inherits the DDI layer controls rather than re-proving them. Evidence for SC-20/21 (DNSSEC), CM-8 (inventory), IA-5(2) (certificates), AU-12 (audit), and IR-4 (incident response) is generated continuously and automatically — not assembled manually for annual assessments.</w:t>
+      </w:r>
+    </w:p>
+    <w:p>
+      <w:pPr>
+        <w:pStyle w:val="BodyText"/>
+      </w:pPr>
+      <w:r>
+        <w:rPr>
+          <w:b/>
+          <w:bCs/>
+        </w:rPr>
+        <w:t xml:space="preserve">3. M365 GCC Boundary Enforcement.</w:t>
+      </w:r>
+      <w:r>
+        <w:t xml:space="preserve"> </w:t>
+      </w:r>
+      <w:r>
+        <w:t xml:space="preserve">Microsoft publishes M365 GCC endpoint changes up to 12 times per year. Without automation, each change requires four manual updates across NSG rules, VPC security groups, RPZ policies, and VPN split-tunnel configurations — during which a gap exists between when Microsoft changes an endpoint and when SSA’s controls reflect it. Infoblox polls the Microsoft 365 IP &amp; URL Web Service API daily and pushes all four enforcement updates simultaneously, closing the boundary gap window to minutes.</w:t>
+      </w:r>
+    </w:p>
+    <w:p>
+      <w:pPr>
+        <w:pStyle w:val="BodyText"/>
+      </w:pPr>
+      <w:r>
+        <w:rPr>
+          <w:b/>
+          <w:bCs/>
+        </w:rPr>
+        <w:t xml:space="preserve">Vendor relationships:</w:t>
+      </w:r>
+      <w:r>
+        <w:t xml:space="preserve"> </w:t>
+      </w:r>
+      <w:r>
+        <w:t xml:space="preserve">InfoBlox has formal technology partnerships with all three of SSA’s primary cloud vendors. InfoBlox BloxOne’s own FedRAMP-authorized service runs</w:t>
+      </w:r>
+      <w:r>
+        <w:t xml:space="preserve"> </w:t>
+      </w:r>
+      <w:r>
+        <w:rPr>
+          <w:i/>
+          <w:iCs/>
+        </w:rPr>
+        <w:t xml:space="preserve">on</w:t>
+      </w:r>
+      <w:r>
+        <w:t xml:space="preserve"> </w:t>
+      </w:r>
+      <w:r>
+        <w:t xml:space="preserve">AWS GovCloud, making AWS the infrastructure foundation. InfoBlox is a Microsoft Azure Technology Alliance Partner with native Microsoft Sentinel, Defender Threat Intelligence, and Entra ID integrations. InfoBlox is available on the Oracle Cloud Marketplace with OCI connector support for the OPM HRIT integration path.</w:t>
+      </w:r>
+    </w:p>
+    <w:p>
+      <w:pPr>
+        <w:pStyle w:val="BodyText"/>
+      </w:pPr>
+      <w:r>
+        <w:t xml:space="preserve">InfoBlox DDI can be deployed via two architecturally distinct paths; the choice determines the FedRAMP authorization inheritance model:</w:t>
+      </w:r>
+    </w:p>
+    <w:p>
+      <w:pPr>
+        <w:pStyle w:val="BodyText"/>
+      </w:pPr>
+      <w:r>
+        <w:rPr>
+          <w:b/>
+          <w:bCs/>
+        </w:rPr>
+        <w:t xml:space="preserve">Path A — BloxOne DDI (Cloud-Managed, FedRAMP ATO Inherited)</w:t>
+      </w:r>
+    </w:p>
+    <w:p>
+      <w:pPr>
+        <w:pStyle w:val="BodyText"/>
+      </w:pPr>
+      <w:r>
+        <w:t xml:space="preserve">InfoBlox operates the management control plane on AWS GovCloud (CSO FR2017257053, authorized January 2023). The agency deploys BloxOne On-Prem Hosts in each environment; they connect to the InfoBlox-hosted management plane. FedRAMP authorization is inherited from InfoBlox’s ATO — the agency does not carry this component independently. Procurement via AWS GovCloud Marketplace (no separate IDIQ required). Best fit if the agency prefers a managed control plane and the simplest FedRAMP inheritance path.</w:t>
+      </w:r>
+    </w:p>
+    <w:p>
+      <w:pPr>
+        <w:pStyle w:val="BodyText"/>
+      </w:pPr>
+      <w:r>
+        <w:rPr>
+          <w:b/>
+          <w:bCs/>
+        </w:rPr>
+        <w:t xml:space="preserve">Path B — NIOS Grid (Agency-Operated, On-Premises Hub)</w:t>
+      </w:r>
+    </w:p>
+    <w:p>
+      <w:pPr>
+        <w:pStyle w:val="BodyText"/>
+      </w:pPr>
+      <w:r>
+        <w:t xml:space="preserve">The agency deploys an InfoBlox NIOS virtual appliance as the Grid Master on-premises (VMware ESXi or physical InfoBlox appliance). Grid Members are deployed in each environment (AWS GovCloud, Azure Government, Oracle OCI, additional on-premises sites) as spokes. The on-premises Grid Master is the authoritative hub; all Grid Members replicate configuration from it and handle local DNS/DHCP/IPAM for their environment. The agency documents NIOS within its own FedRAMP boundary — no ATO inheritance from InfoBlox’s CSO. Procurement via GSA Schedule (GS-35F) or agency IDIQ contract vehicle.</w:t>
+      </w:r>
+    </w:p>
+    <w:p>
+      <w:pPr>
+        <w:pStyle w:val="BlockText"/>
+      </w:pPr>
+      <w:r>
+        <w:rPr>
+          <w:b/>
+          <w:bCs/>
+        </w:rPr>
+        <w:t xml:space="preserve">SSA topology note:</w:t>
+      </w:r>
+      <w:r>
+        <w:t xml:space="preserve"> </w:t>
+      </w:r>
+      <w:r>
+        <w:t xml:space="preserve">For SSA’s multi-cloud architecture spanning AWS GovCloud, Azure Government, Oracle OCI, and on-premises VMware, Path B — NIOS Grid with an on-premises Grid Master — more closely matches SSA’s topology. No single cloud provider is the hub; all four environments are equal spokes of the on-premises control plane. The decision between Path A and Path B should involve OIS and the CIO Office, as it determines whether InfoBlox is a shared-responsibility SaaS or an agency-operated infrastructure component. Agency selection pending.</w:t>
+      </w:r>
+    </w:p>
+    <w:p>
+      <w:r>
+        <w:pict>
+          <v:rect style="width:0;height:1.5pt" o:hralign="center" o:hrstd="t" o:hr="t"/>
+        </w:pict>
+      </w:r>
+    </w:p>
+    <w:bookmarkEnd w:id="12"/>
+    <w:bookmarkStart w:id="28" w:name="sec-landing-zone"/>
+    <w:p>
+      <w:pPr>
+        <w:pStyle w:val="Heading2"/>
+      </w:pPr>
+      <w:r>
+        <w:t xml:space="preserve">1 What Is a Federal Cloud Landing Zone?</w:t>
+      </w:r>
+    </w:p>
+    <w:p>
+      <w:pPr>
+        <w:pStyle w:val="FirstParagraph"/>
+      </w:pPr>
+      <w:r>
+        <w:t xml:space="preserve">A Cloud Landing Zone is the foundational, pre-configured environment that a federal agency provisions</w:t>
+      </w:r>
+      <w:r>
+        <w:t xml:space="preserve"> </w:t>
+      </w:r>
+      <w:r>
+        <w:rPr>
+          <w:i/>
+          <w:iCs/>
+        </w:rPr>
+        <w:t xml:space="preserve">before</w:t>
+      </w:r>
+      <w:r>
+        <w:t xml:space="preserve"> </w:t>
+      </w:r>
+      <w:r>
+        <w:t xml:space="preserve">any workload is deployed. It establishes the guardrails — network topology, identity controls, logging pipelines, encryption policies, and security baselines — that every subsequent workload inherits automatically.</w:t>
+      </w:r>
+    </w:p>
+    <w:p>
+      <w:pPr>
+        <w:pStyle w:val="BodyText"/>
+      </w:pPr>
+      <w:r>
+        <w:t xml:space="preserve">For SSA operating under FedRAMP Moderate, the landing zone must satisfy four overlapping frameworks simultaneously:</w:t>
+      </w:r>
+    </w:p>
+    <w:p>
+      <w:pPr>
+        <w:pStyle w:val="Compact"/>
+        <w:numPr>
+          <w:ilvl w:val="0"/>
+          <w:numId w:val="1001"/>
+        </w:numPr>
+      </w:pPr>
+      <w:r>
+        <w:rPr>
+          <w:b/>
+          <w:bCs/>
+        </w:rPr>
+        <w:t xml:space="preserve">NIST SP 800-53 Rev 5</w:t>
+      </w:r>
+      <w:r>
+        <w:t xml:space="preserve"> </w:t>
+      </w:r>
+      <w:r>
+        <w:t xml:space="preserve">— the control catalog from which FedRAMP Moderate baselines are drawn</w:t>
+      </w:r>
+    </w:p>
+    <w:p>
+      <w:pPr>
+        <w:pStyle w:val="Compact"/>
+        <w:numPr>
+          <w:ilvl w:val="0"/>
+          <w:numId w:val="1001"/>
+        </w:numPr>
+      </w:pPr>
+      <w:r>
+        <w:rPr>
+          <w:b/>
+          <w:bCs/>
+        </w:rPr>
+        <w:t xml:space="preserve">CISA Zero Trust Maturity Model v2.0</w:t>
+      </w:r>
+      <w:r>
+        <w:t xml:space="preserve"> </w:t>
+      </w:r>
+      <w:r>
+        <w:t xml:space="preserve">— five pillars with three cross-cutting capabilities</w:t>
+      </w:r>
+    </w:p>
+    <w:p>
+      <w:pPr>
+        <w:pStyle w:val="Compact"/>
+        <w:numPr>
+          <w:ilvl w:val="0"/>
+          <w:numId w:val="1001"/>
+        </w:numPr>
+      </w:pPr>
+      <w:r>
+        <w:rPr>
+          <w:b/>
+          <w:bCs/>
+        </w:rPr>
+        <w:t xml:space="preserve">FedRAMP Moderate</w:t>
+      </w:r>
+      <w:r>
+        <w:t xml:space="preserve"> </w:t>
+      </w:r>
+      <w:r>
+        <w:t xml:space="preserve">— boundary definition, continuous monitoring, evidence packaging</w:t>
+      </w:r>
+    </w:p>
+    <w:p>
+      <w:pPr>
+        <w:pStyle w:val="Compact"/>
+        <w:numPr>
+          <w:ilvl w:val="0"/>
+          <w:numId w:val="1001"/>
+        </w:numPr>
+      </w:pPr>
+      <w:r>
+        <w:rPr>
+          <w:b/>
+          <w:bCs/>
+        </w:rPr>
+        <w:t xml:space="preserve">FedRAMP 20x Consolidated Rules (2026)</w:t>
+      </w:r>
+      <w:r>
+        <w:t xml:space="preserve"> </w:t>
+      </w:r>
+      <w:r>
+        <w:t xml:space="preserve">— automated, machine-readable compliance evidence enforced by infrastructure-as-code; Class A/B/C certification pipelines; mandatory January 1, 2027</w:t>
+      </w:r>
+    </w:p>
+    <w:tbl>
+      <w:tblPr>
+        <w:tblStyle w:val="Table"/>
+        <w:tblLook w:firstRow="0" w:lastRow="0" w:firstColumn="0" w:lastColumn="0" w:noHBand="0" w:noVBand="0" w:val="0000"/>
+        <w:tblBorders>
+          <w:top w:val="single" w:sz="4" w:space="0" w:color="CC1914"/>
+          <w:left w:val="single" w:sz="24" w:space="0" w:color="CC1914"/>
+          <w:bottom w:val="single" w:sz="4" w:space="0" w:color="CC1914"/>
+          <w:right w:val="single" w:sz="4" w:space="0" w:color="CC1914"/>
+        </w:tblBorders>
+        <w:tblCellMar>
+          <w:left w:w="144" w:type="dxa"/>
+          <w:right w:w="144" w:type="dxa"/>
+        </w:tblCellMar>
+        <w:tblLook w:firstRow="0" w:lastRow="0" w:firstColumn="0" w:lastColumn="0" w:noHBand="0" w:noVBand="0" w:val="0000"/>
+      </w:tblPr>
+      <w:tr>
+        <w:trPr>
+          <w:cantSplit/>
+        </w:trPr>
+        <w:tc>
+          <w:tcPr>
+            <w:shd w:color="auto" w:fill="f7dddc" w:val="clear"/>
+            <w:tcMar>
+              <w:top w:w="92" w:type="dxa"/>
+              <w:bottom w:w="92" w:type="dxa"/>
+            </w:tcMar>
+          </w:tcPr>
+          <w:p>
+            <w:pPr>
+              <w:pStyle w:val="FirstParagraph"/>
+            </w:pPr>
+            <w:pPr>
+              <w:spacing w:before="0" w:after="0"/>
+              <w:textAlignment w:val="center"/>
+            </w:pPr>
+            <w:r>
+              <w:drawing>
+                <wp:inline>
+                  <wp:extent cx="152400" cy="152400"/>
+                  <wp:effectExtent b="0" l="0" r="0" t="0"/>
+                  <wp:docPr descr="" title="" id="14" name="Picture"/>
+                  <a:graphic>
+                    <a:graphicData uri="http://schemas.openxmlformats.org/drawingml/2006/picture">
+                      <pic:pic>
+                        <pic:nvPicPr>
+                          <pic:cNvPr descr="/opt/quarto/share/formats/docx/important.png" id="15" name="Picture"/>
+                          <pic:cNvPicPr>
+                            <a:picLocks noChangeArrowheads="1" noChangeAspect="1"/>
+                          </pic:cNvPicPr>
+                        </pic:nvPicPr>
+                        <pic:blipFill>
+                          <a:blip r:embed="rId13"/>
+                          <a:stretch>
+                            <a:fillRect/>
+                          </a:stretch>
+                        </pic:blipFill>
+                        <pic:spPr bwMode="auto">
+                          <a:xfrm>
+                            <a:off x="0" y="0"/>
+                            <a:ext cx="152400" cy="152400"/>
+                          </a:xfrm>
+                          <a:prstGeom prst="rect">
+                            <a:avLst/>
+                          </a:prstGeom>
+                          <a:noFill/>
+                          <a:ln w="9525">
+                            <a:noFill/>
+                            <a:headEnd/>
+                            <a:tailEnd/>
+                          </a:ln>
+                        </pic:spPr>
+                      </pic:pic>
+                    </a:graphicData>
+                  </a:graphic>
+                </wp:inline>
+              </w:drawing>
+            </w:r>
+            <w:r>
+              <w:t xml:space="preserve"> </w:t>
+            </w:r>
+            <w:r>
+              <w:t xml:space="preserve"> </w:t>
+            </w:r>
+            <w:r>
+              <w:t xml:space="preserve">Important</w:t>
+            </w:r>
+          </w:p>
+        </w:tc>
+      </w:tr>
+      <w:tr>
+        <w:trPr>
+          <w:cantSplit/>
+        </w:trPr>
+        <w:tc>
+          <w:tcPr>
+            <w:tcMar>
+              <w:top w:w="108" w:type="dxa"/>
+              <w:bottom w:w="108" w:type="dxa"/>
+            </w:tcMar>
+          </w:tcPr>
+          <w:p>
+            <w:pPr>
+              <w:pStyle w:val="BodyText"/>
+            </w:pPr>
+            <w:pPr>
+              <w:spacing w:before="16" w:after="16"/>
+            </w:pPr>
+            <w:r>
               <w:rPr>
                 <w:b/>
                 <w:bCs/>
@@ -505,18 +698,18 @@
           <wp:inline>
             <wp:extent cx="5334000" cy="2963333"/>
             <wp:effectExtent b="0" l="0" r="0" t="0"/>
-            <wp:docPr descr="FedRAMP 20x Consolidated Rules for 2026 — Class Timelines and Key Dates" title="" id="14" name="Picture"/>
+            <wp:docPr descr="FedRAMP 20x Consolidated Rules for 2026 — Class Timelines and Key Dates" title="" id="17" name="Picture"/>
             <a:graphic>
               <a:graphicData uri="http://schemas.openxmlformats.org/drawingml/2006/picture">
                 <pic:pic>
                   <pic:nvPicPr>
-                    <pic:cNvPr descr="figs/lz-fig-10-fedramp-20x.png" id="15" name="Picture"/>
+                    <pic:cNvPr descr="figs/lz-fig-10-fedramp-20x.png" id="18" name="Picture"/>
                     <pic:cNvPicPr>
                       <a:picLocks noChangeArrowheads="1" noChangeAspect="1"/>
                     </pic:cNvPicPr>
                   </pic:nvPicPr>
                   <pic:blipFill>
-                    <a:blip r:embed="rId13"/>
+                    <a:blip r:embed="rId16"/>
                     <a:stretch>
                       <a:fillRect/>
                     </a:stretch>
@@ -592,18 +785,18 @@
                 <wp:inline>
                   <wp:extent cx="152400" cy="152400"/>
                   <wp:effectExtent b="0" l="0" r="0" t="0"/>
-                  <wp:docPr descr="" title="" id="16" name="Picture"/>
+                  <wp:docPr descr="" title="" id="19" name="Picture"/>
                   <a:graphic>
                     <a:graphicData uri="http://schemas.openxmlformats.org/drawingml/2006/picture">
                       <pic:pic>
                         <pic:nvPicPr>
-                          <pic:cNvPr descr="/opt/quarto/share/formats/docx/important.png" id="17" name="Picture"/>
+                          <pic:cNvPr descr="/opt/quarto/share/formats/docx/important.png" id="20" name="Picture"/>
                           <pic:cNvPicPr>
                             <a:picLocks noChangeArrowheads="1" noChangeAspect="1"/>
                           </pic:cNvPicPr>
                         </pic:nvPicPr>
                         <pic:blipFill>
-                          <a:blip r:embed="rId10"/>
+                          <a:blip r:embed="rId13"/>
                           <a:stretch>
                             <a:fillRect/>
                           </a:stretch>
@@ -677,7 +870,7 @@
         </w:tc>
       </w:tr>
     </w:tbl>
-    <w:bookmarkStart w:id="24" w:name="sec-scope"/>
+    <w:bookmarkStart w:id="27" w:name="sec-scope"/>
     <w:p>
       <w:pPr>
         <w:pStyle w:val="Heading3"/>
@@ -695,18 +888,18 @@
           <wp:inline>
             <wp:extent cx="5334000" cy="2963333"/>
             <wp:effectExtent b="0" l="0" r="0" t="0"/>
-            <wp:docPr descr="Four Environments — Blind Islands vs. Unified InfoBlox Visibility" title="" id="19" name="Picture"/>
+            <wp:docPr descr="Four Environments — Blind Islands vs. Unified InfoBlox Visibility" title="" id="22" name="Picture"/>
             <a:graphic>
               <a:graphicData uri="http://schemas.openxmlformats.org/drawingml/2006/picture">
                 <pic:pic>
                   <pic:nvPicPr>
-                    <pic:cNvPr descr="figs/lz-fig-12-four-env.png" id="20" name="Picture"/>
+                    <pic:cNvPr descr="figs/lz-fig-12-four-env.png" id="23" name="Picture"/>
                     <pic:cNvPicPr>
                       <a:picLocks noChangeArrowheads="1" noChangeAspect="1"/>
                     </pic:cNvPicPr>
                   </pic:nvPicPr>
                   <pic:blipFill>
-                    <a:blip r:embed="rId18"/>
+                    <a:blip r:embed="rId21"/>
                     <a:stretch>
                       <a:fillRect/>
                     </a:stretch>
@@ -750,18 +943,18 @@
           <wp:inline>
             <wp:extent cx="5334000" cy="3111500"/>
             <wp:effectExtent b="0" l="0" r="0" t="0"/>
-            <wp:docPr descr="InfoBlox DDI as the Unified Control Plane for SSA’s Four-Environment Landing Zone" title="" id="22" name="Picture"/>
+            <wp:docPr descr="InfoBlox DDI as the Unified Control Plane for SSA’s Four-Environment Landing Zone" title="" id="25" name="Picture"/>
             <a:graphic>
               <a:graphicData uri="http://schemas.openxmlformats.org/drawingml/2006/picture">
                 <pic:pic>
                   <pic:nvPicPr>
-                    <pic:cNvPr descr="figs/lz-fig-01-control-hub.png" id="23" name="Picture"/>
+                    <pic:cNvPr descr="figs/lz-fig-01-control-hub.png" id="26" name="Picture"/>
                     <pic:cNvPicPr>
                       <a:picLocks noChangeArrowheads="1" noChangeAspect="1"/>
                     </pic:cNvPicPr>
                   </pic:nvPicPr>
                   <pic:blipFill>
-                    <a:blip r:embed="rId21"/>
+                    <a:blip r:embed="rId24"/>
                     <a:stretch>
                       <a:fillRect/>
                     </a:stretch>
@@ -1147,9 +1340,9 @@
         </w:pict>
       </w:r>
     </w:p>
-    <w:bookmarkEnd w:id="24"/>
-    <w:bookmarkEnd w:id="25"/>
-    <w:bookmarkStart w:id="39" w:name="sec-sdn"/>
+    <w:bookmarkEnd w:id="27"/>
+    <w:bookmarkEnd w:id="28"/>
+    <w:bookmarkStart w:id="42" w:name="sec-sdn"/>
     <w:p>
       <w:pPr>
         <w:pStyle w:val="Heading2"/>
@@ -1167,18 +1360,18 @@
           <wp:inline>
             <wp:extent cx="5334000" cy="2963333"/>
             <wp:effectExtent b="0" l="0" r="0" t="0"/>
-            <wp:docPr descr="DNS Query Journey: InfoBlox RPZ Enforcement Gate" title="" id="27" name="Picture"/>
+            <wp:docPr descr="DNS Query Journey: InfoBlox RPZ Enforcement Gate" title="" id="30" name="Picture"/>
             <a:graphic>
               <a:graphicData uri="http://schemas.openxmlformats.org/drawingml/2006/picture">
                 <pic:pic>
                   <pic:nvPicPr>
-                    <pic:cNvPr descr="figs/lz-fig-08-dns-journey.png" id="28" name="Picture"/>
+                    <pic:cNvPr descr="figs/lz-fig-08-dns-journey.png" id="31" name="Picture"/>
                     <pic:cNvPicPr>
                       <a:picLocks noChangeArrowheads="1" noChangeAspect="1"/>
                     </pic:cNvPicPr>
                   </pic:nvPicPr>
                   <pic:blipFill>
-                    <a:blip r:embed="rId26"/>
+                    <a:blip r:embed="rId29"/>
                     <a:stretch>
                       <a:fillRect/>
                     </a:stretch>
@@ -1222,18 +1415,18 @@
           <wp:inline>
             <wp:extent cx="5334000" cy="2844800"/>
             <wp:effectExtent b="0" l="0" r="0" t="0"/>
-            <wp:docPr descr="SDN Replaces Broadcast DHCP — InfoBlox Restores Enterprise Visibility" title="" id="30" name="Picture"/>
+            <wp:docPr descr="SDN Replaces Broadcast DHCP — InfoBlox Restores Enterprise Visibility" title="" id="33" name="Picture"/>
             <a:graphic>
               <a:graphicData uri="http://schemas.openxmlformats.org/drawingml/2006/picture">
                 <pic:pic>
                   <pic:nvPicPr>
-                    <pic:cNvPr descr="figs/lz-fig-02-sdn-dhcp.png" id="31" name="Picture"/>
+                    <pic:cNvPr descr="figs/lz-fig-02-sdn-dhcp.png" id="34" name="Picture"/>
                     <pic:cNvPicPr>
                       <a:picLocks noChangeArrowheads="1" noChangeAspect="1"/>
                     </pic:cNvPicPr>
                   </pic:nvPicPr>
                   <pic:blipFill>
-                    <a:blip r:embed="rId29"/>
+                    <a:blip r:embed="rId32"/>
                     <a:stretch>
                       <a:fillRect/>
                     </a:stretch>
@@ -1276,7 +1469,7 @@
         <w:t xml:space="preserve">Traditional DHCP (RFC 2131) depends on Layer 2 broadcast. This model fundamentally breaks in Software Defined Networking environments because SDN uses overlay protocols (VXLAN, Geneve, STT) that operate at Layer 3 and suppress Layer 2 broadcasts by design.</w:t>
       </w:r>
     </w:p>
-    <w:bookmarkStart w:id="35" w:name="sec-nsx"/>
+    <w:bookmarkStart w:id="38" w:name="sec-nsx"/>
     <w:p>
       <w:pPr>
         <w:pStyle w:val="Heading3"/>
@@ -1446,18 +1639,18 @@
                 <wp:inline>
                   <wp:extent cx="152400" cy="152400"/>
                   <wp:effectExtent b="0" l="0" r="0" t="0"/>
-                  <wp:docPr descr="" title="" id="33" name="Picture"/>
+                  <wp:docPr descr="" title="" id="36" name="Picture"/>
                   <a:graphic>
                     <a:graphicData uri="http://schemas.openxmlformats.org/drawingml/2006/picture">
                       <pic:pic>
                         <pic:nvPicPr>
-                          <pic:cNvPr descr="/opt/quarto/share/formats/docx/tip.png" id="34" name="Picture"/>
+                          <pic:cNvPr descr="/opt/quarto/share/formats/docx/tip.png" id="37" name="Picture"/>
                           <pic:cNvPicPr>
                             <a:picLocks noChangeArrowheads="1" noChangeAspect="1"/>
                           </pic:cNvPicPr>
                         </pic:nvPicPr>
                         <pic:blipFill>
-                          <a:blip r:embed="rId32"/>
+                          <a:blip r:embed="rId35"/>
                           <a:stretch>
                             <a:fillRect/>
                           </a:stretch>
@@ -1531,8 +1724,8 @@
         </w:tc>
       </w:tr>
     </w:tbl>
-    <w:bookmarkEnd w:id="35"/>
-    <w:bookmarkStart w:id="36" w:name="sec-azure"/>
+    <w:bookmarkEnd w:id="38"/>
+    <w:bookmarkStart w:id="39" w:name="sec-azure"/>
     <w:p>
       <w:pPr>
         <w:pStyle w:val="Heading3"/>
@@ -1581,8 +1774,8 @@
         <w:t xml:space="preserve">continuously pulls VNet subnet configurations and VM NIC IP assignments via the Azure Resource Manager API, writing every Azure IP into the Azure-GCC Network View in the InfoBlox IPAM database.</w:t>
       </w:r>
     </w:p>
-    <w:bookmarkEnd w:id="36"/>
-    <w:bookmarkStart w:id="37" w:name="sec-aws-dhcp"/>
+    <w:bookmarkEnd w:id="39"/>
+    <w:bookmarkStart w:id="40" w:name="sec-aws-dhcp"/>
     <w:p>
       <w:pPr>
         <w:pStyle w:val="Heading3"/>
@@ -1639,8 +1832,8 @@
         <w:t xml:space="preserve">syncs EC2 instance IP assignments, subnet CIDRs, and VPC IPAM pool allocations into the AWS-GovCloud Network View.</w:t>
       </w:r>
     </w:p>
-    <w:bookmarkEnd w:id="37"/>
-    <w:bookmarkStart w:id="38" w:name="sec-oci-dhcp"/>
+    <w:bookmarkEnd w:id="40"/>
+    <w:bookmarkStart w:id="41" w:name="sec-oci-dhcp"/>
     <w:p>
       <w:pPr>
         <w:pStyle w:val="Heading3"/>
@@ -1672,9 +1865,9 @@
         </w:pict>
       </w:r>
     </w:p>
-    <w:bookmarkEnd w:id="38"/>
-    <w:bookmarkEnd w:id="39"/>
-    <w:bookmarkStart w:id="70" w:name="sec-infoblox"/>
+    <w:bookmarkEnd w:id="41"/>
+    <w:bookmarkEnd w:id="42"/>
+    <w:bookmarkStart w:id="82" w:name="sec-infoblox"/>
     <w:p>
       <w:pPr>
         <w:pStyle w:val="Heading2"/>
@@ -1707,7 +1900,62 @@
         <w:t xml:space="preserve">— not replacing the SDN fabric’s internal IP assignment mechanisms, but serving as the authoritative record and policy engine above them.</w:t>
       </w:r>
     </w:p>
-    <w:bookmarkStart w:id="40" w:name="sec-value"/>
+    <w:p>
+      <w:pPr>
+        <w:pStyle w:val="CaptionedFigure"/>
+      </w:pPr>
+      <w:r>
+        <w:drawing>
+          <wp:inline>
+            <wp:extent cx="5334000" cy="2461846"/>
+            <wp:effectExtent b="0" l="0" r="0" t="0"/>
+            <wp:docPr descr="From Manual Address Management to a Policy-Driven DDI Control Plane" title="" id="44" name="Picture"/>
+            <a:graphic>
+              <a:graphicData uri="http://schemas.openxmlformats.org/drawingml/2006/picture">
+                <pic:pic>
+                  <pic:nvPicPr>
+                    <pic:cNvPr descr="figs/lz-fig-19-legacy-modern-ipam.png" id="45" name="Picture"/>
+                    <pic:cNvPicPr>
+                      <a:picLocks noChangeArrowheads="1" noChangeAspect="1"/>
+                    </pic:cNvPicPr>
+                  </pic:nvPicPr>
+                  <pic:blipFill>
+                    <a:blip r:embed="rId43"/>
+                    <a:stretch>
+                      <a:fillRect/>
+                    </a:stretch>
+                  </pic:blipFill>
+                  <pic:spPr bwMode="auto">
+                    <a:xfrm>
+                      <a:off x="0" y="0"/>
+                      <a:ext cx="5334000" cy="2461846"/>
+                    </a:xfrm>
+                    <a:prstGeom prst="rect">
+                      <a:avLst/>
+                    </a:prstGeom>
+                    <a:noFill/>
+                    <a:ln w="9525">
+                      <a:noFill/>
+                      <a:headEnd/>
+                      <a:tailEnd/>
+                    </a:ln>
+                  </pic:spPr>
+                </pic:pic>
+              </a:graphicData>
+            </a:graphic>
+          </wp:inline>
+        </w:drawing>
+      </w:r>
+    </w:p>
+    <w:p>
+      <w:pPr>
+        <w:pStyle w:val="ImageCaption"/>
+      </w:pPr>
+      <w:r>
+        <w:t xml:space="preserve">From Manual Address Management to a Policy-Driven DDI Control Plane</w:t>
+      </w:r>
+    </w:p>
+    <w:bookmarkStart w:id="46" w:name="sec-value"/>
     <w:p>
       <w:pPr>
         <w:pStyle w:val="Heading3"/>
@@ -2021,16 +2269,269 @@
         </w:tc>
       </w:tr>
     </w:tbl>
-    <w:bookmarkEnd w:id="40"/>
-    <w:bookmarkStart w:id="54" w:name="sec-microsoft"/>
+    <w:bookmarkEnd w:id="46"/>
+    <w:bookmarkStart w:id="52" w:name="sec-gridmaster-trust"/>
     <w:p>
       <w:pPr>
         <w:pStyle w:val="Heading3"/>
       </w:pPr>
       <w:r>
-        <w:t xml:space="preserve">3.2 Microsoft Partnership: M365 GCC Endpoint Lifecycle</w:t>
-      </w:r>
-    </w:p>
+        <w:t xml:space="preserve">3.2 Grid Master Deployment — On-Premises VMware and the Trust Case</w:t>
+      </w:r>
+    </w:p>
+    <w:p>
+      <w:pPr>
+        <w:pStyle w:val="FirstParagraph"/>
+      </w:pPr>
+      <w:r>
+        <w:t xml:space="preserve">For SSA, the InfoBlox NIOS Grid Master should be deployed as a</w:t>
+      </w:r>
+      <w:r>
+        <w:t xml:space="preserve"> </w:t>
+      </w:r>
+      <w:r>
+        <w:rPr>
+          <w:b/>
+          <w:bCs/>
+        </w:rPr>
+        <w:t xml:space="preserve">virtual machine on on-premises VMware infrastructure</w:t>
+      </w:r>
+      <w:r>
+        <w:t xml:space="preserve"> </w:t>
+      </w:r>
+      <w:r>
+        <w:t xml:space="preserve">(Path B from the Executive Summary). This is not only a technical topology choice — it is a trust architecture decision. DNS, DHCP, and IPAM together constitute the network naming and addressing control plane: every device’s address, every workload’s hostname, and every certificate’s subject name flows through them. Placing the Grid Master on-premises means SSA retains:</w:t>
+      </w:r>
+    </w:p>
+    <w:p>
+      <w:pPr>
+        <w:pStyle w:val="Compact"/>
+        <w:numPr>
+          <w:ilvl w:val="0"/>
+          <w:numId w:val="1003"/>
+        </w:numPr>
+      </w:pPr>
+      <w:r>
+        <w:rPr>
+          <w:b/>
+          <w:bCs/>
+        </w:rPr>
+        <w:t xml:space="preserve">Hypervisor-layer control</w:t>
+      </w:r>
+      <w:r>
+        <w:t xml:space="preserve"> </w:t>
+      </w:r>
+      <w:r>
+        <w:t xml:space="preserve">— the Grid Master VM runs under SSA infrastructure team governance, not a cloud provider’s control plane</w:t>
+      </w:r>
+    </w:p>
+    <w:p>
+      <w:pPr>
+        <w:pStyle w:val="Compact"/>
+        <w:numPr>
+          <w:ilvl w:val="0"/>
+          <w:numId w:val="1003"/>
+        </w:numPr>
+      </w:pPr>
+      <w:r>
+        <w:rPr>
+          <w:b/>
+          <w:bCs/>
+        </w:rPr>
+        <w:t xml:space="preserve">Physical network isolation</w:t>
+      </w:r>
+      <w:r>
+        <w:t xml:space="preserve"> </w:t>
+      </w:r>
+      <w:r>
+        <w:t xml:space="preserve">— the master is reachable from all four environments via dedicated management interfaces, not via public internet or cloud-provider backbone</w:t>
+      </w:r>
+    </w:p>
+    <w:p>
+      <w:pPr>
+        <w:pStyle w:val="Compact"/>
+        <w:numPr>
+          <w:ilvl w:val="0"/>
+          <w:numId w:val="1003"/>
+        </w:numPr>
+      </w:pPr>
+      <w:r>
+        <w:rPr>
+          <w:b/>
+          <w:bCs/>
+        </w:rPr>
+        <w:t xml:space="preserve">No single-cloud dependency</w:t>
+      </w:r>
+      <w:r>
+        <w:t xml:space="preserve"> </w:t>
+      </w:r>
+      <w:r>
+        <w:t xml:space="preserve">— if any one cloud environment (AWS GovCloud, Azure Government, OCI) experiences an outage or a control-plane incident, the Grid Master continues to function from on-premises</w:t>
+      </w:r>
+    </w:p>
+    <w:p>
+      <w:pPr>
+        <w:pStyle w:val="Compact"/>
+        <w:numPr>
+          <w:ilvl w:val="0"/>
+          <w:numId w:val="1003"/>
+        </w:numPr>
+      </w:pPr>
+      <w:r>
+        <w:rPr>
+          <w:b/>
+          <w:bCs/>
+        </w:rPr>
+        <w:t xml:space="preserve">Boundary clarity</w:t>
+      </w:r>
+      <w:r>
+        <w:t xml:space="preserve"> </w:t>
+      </w:r>
+      <w:r>
+        <w:t xml:space="preserve">— the NIOS Grid falls within SSA’s own FedRAMP authorization boundary; the agency controls the ATO evidence rather than inheriting it from a vendor CSO</w:t>
+      </w:r>
+    </w:p>
+    <w:tbl>
+      <w:tblPr>
+        <w:tblStyle w:val="Table"/>
+        <w:tblLook w:firstRow="0" w:lastRow="0" w:firstColumn="0" w:lastColumn="0" w:noHBand="0" w:noVBand="0" w:val="0000"/>
+        <w:tblBorders>
+          <w:top w:val="single" w:sz="4" w:space="0" w:color="CC1914"/>
+          <w:left w:val="single" w:sz="24" w:space="0" w:color="CC1914"/>
+          <w:bottom w:val="single" w:sz="4" w:space="0" w:color="CC1914"/>
+          <w:right w:val="single" w:sz="4" w:space="0" w:color="CC1914"/>
+        </w:tblBorders>
+        <w:tblCellMar>
+          <w:left w:w="144" w:type="dxa"/>
+          <w:right w:w="144" w:type="dxa"/>
+        </w:tblCellMar>
+        <w:tblLook w:firstRow="0" w:lastRow="0" w:firstColumn="0" w:lastColumn="0" w:noHBand="0" w:noVBand="0" w:val="0000"/>
+      </w:tblPr>
+      <w:tr>
+        <w:trPr>
+          <w:cantSplit/>
+        </w:trPr>
+        <w:tc>
+          <w:tcPr>
+            <w:shd w:color="auto" w:fill="f7dddc" w:val="clear"/>
+            <w:tcMar>
+              <w:top w:w="92" w:type="dxa"/>
+              <w:bottom w:w="92" w:type="dxa"/>
+            </w:tcMar>
+          </w:tcPr>
+          <w:p>
+            <w:pPr>
+              <w:pStyle w:val="FirstParagraph"/>
+            </w:pPr>
+            <w:pPr>
+              <w:spacing w:before="0" w:after="0"/>
+              <w:textAlignment w:val="center"/>
+            </w:pPr>
+            <w:r>
+              <w:drawing>
+                <wp:inline>
+                  <wp:extent cx="152400" cy="152400"/>
+                  <wp:effectExtent b="0" l="0" r="0" t="0"/>
+                  <wp:docPr descr="" title="" id="47" name="Picture"/>
+                  <a:graphic>
+                    <a:graphicData uri="http://schemas.openxmlformats.org/drawingml/2006/picture">
+                      <pic:pic>
+                        <pic:nvPicPr>
+                          <pic:cNvPr descr="/opt/quarto/share/formats/docx/important.png" id="48" name="Picture"/>
+                          <pic:cNvPicPr>
+                            <a:picLocks noChangeArrowheads="1" noChangeAspect="1"/>
+                          </pic:cNvPicPr>
+                        </pic:nvPicPr>
+                        <pic:blipFill>
+                          <a:blip r:embed="rId13"/>
+                          <a:stretch>
+                            <a:fillRect/>
+                          </a:stretch>
+                        </pic:blipFill>
+                        <pic:spPr bwMode="auto">
+                          <a:xfrm>
+                            <a:off x="0" y="0"/>
+                            <a:ext cx="152400" cy="152400"/>
+                          </a:xfrm>
+                          <a:prstGeom prst="rect">
+                            <a:avLst/>
+                          </a:prstGeom>
+                          <a:noFill/>
+                          <a:ln w="9525">
+                            <a:noFill/>
+                            <a:headEnd/>
+                            <a:tailEnd/>
+                          </a:ln>
+                        </pic:spPr>
+                      </pic:pic>
+                    </a:graphicData>
+                  </a:graphic>
+                </wp:inline>
+              </w:drawing>
+            </w:r>
+            <w:r>
+              <w:t xml:space="preserve"> </w:t>
+            </w:r>
+            <w:r>
+              <w:t xml:space="preserve"> </w:t>
+            </w:r>
+            <w:r>
+              <w:t xml:space="preserve">Important</w:t>
+            </w:r>
+          </w:p>
+        </w:tc>
+      </w:tr>
+      <w:tr>
+        <w:trPr>
+          <w:cantSplit/>
+        </w:trPr>
+        <w:tc>
+          <w:tcPr>
+            <w:tcMar>
+              <w:top w:w="108" w:type="dxa"/>
+              <w:bottom w:w="108" w:type="dxa"/>
+            </w:tcMar>
+          </w:tcPr>
+          <w:p>
+            <w:pPr>
+              <w:pStyle w:val="BodyText"/>
+            </w:pPr>
+            <w:pPr>
+              <w:spacing w:before="16"/>
+            </w:pPr>
+            <w:r>
+              <w:rPr>
+                <w:b/>
+                <w:bCs/>
+              </w:rPr>
+              <w:t xml:space="preserve">Trust rationale:</w:t>
+            </w:r>
+            <w:r>
+              <w:t xml:space="preserve"> </w:t>
+            </w:r>
+            <w:r>
+              <w:t xml:space="preserve">DNS poisoning, DHCP scope hijacking, and IPAM record manipulation are among the highest-impact attack vectors against network infrastructure. An adversary who controls the Grid Master can redirect any FQDN, drain any IP subnet, or suppress any workload’s DNS record — effectively owning the naming plane for all four SSA environments simultaneously. On-premises VMware deployment keeps this function under SSA’s direct institutional control.</w:t>
+            </w:r>
+          </w:p>
+          <w:p>
+            <w:pPr>
+              <w:pStyle w:val="BodyText"/>
+            </w:pPr>
+            <w:pPr>
+              <w:spacing w:after="16"/>
+            </w:pPr>
+            <w:r>
+              <w:rPr>
+                <w:b/>
+                <w:bCs/>
+              </w:rPr>
+              <w:t xml:space="preserve">OIS and the CIO Office must validate the trust boundary decision and define the Grid Admin role-holder accountability model before the Grid is deployed.</w:t>
+            </w:r>
+          </w:p>
+          <w:p/>
+        </w:tc>
+      </w:tr>
+    </w:tbl>
     <w:p>
       <w:pPr>
         <w:pStyle w:val="CaptionedFigure"/>
@@ -2038,20 +2539,569 @@
       <w:r>
         <w:drawing>
           <wp:inline>
-            <wp:extent cx="5334000" cy="3022600"/>
+            <wp:extent cx="5334000" cy="2667000"/>
             <wp:effectExtent b="0" l="0" r="0" t="0"/>
-            <wp:docPr descr="Microsoft × InfoBlox Technology Partnership — Six Integration Points" title="" id="42" name="Picture"/>
+            <wp:docPr descr="InfoBlox NIOS Grid Master — Least-Privilege Delegation Model" title="" id="50" name="Picture"/>
             <a:graphic>
               <a:graphicData uri="http://schemas.openxmlformats.org/drawingml/2006/picture">
                 <pic:pic>
                   <pic:nvPicPr>
-                    <pic:cNvPr descr="figs/lz-fig-03-ms-partnership.png" id="43" name="Picture"/>
+                    <pic:cNvPr descr="figs/lz-fig-20-ipam-delegation.png" id="51" name="Picture"/>
                     <pic:cNvPicPr>
                       <a:picLocks noChangeArrowheads="1" noChangeAspect="1"/>
                     </pic:cNvPicPr>
                   </pic:nvPicPr>
                   <pic:blipFill>
-                    <a:blip r:embed="rId41"/>
+                    <a:blip r:embed="rId49"/>
+                    <a:stretch>
+                      <a:fillRect/>
+                    </a:stretch>
+                  </pic:blipFill>
+                  <pic:spPr bwMode="auto">
+                    <a:xfrm>
+                      <a:off x="0" y="0"/>
+                      <a:ext cx="5334000" cy="2667000"/>
+                    </a:xfrm>
+                    <a:prstGeom prst="rect">
+                      <a:avLst/>
+                    </a:prstGeom>
+                    <a:noFill/>
+                    <a:ln w="9525">
+                      <a:noFill/>
+                      <a:headEnd/>
+                      <a:tailEnd/>
+                    </a:ln>
+                  </pic:spPr>
+                </pic:pic>
+              </a:graphicData>
+            </a:graphic>
+          </wp:inline>
+        </w:drawing>
+      </w:r>
+    </w:p>
+    <w:p>
+      <w:pPr>
+        <w:pStyle w:val="ImageCaption"/>
+      </w:pPr>
+      <w:r>
+        <w:t xml:space="preserve">InfoBlox NIOS Grid Master — Least-Privilege Delegation Model</w:t>
+      </w:r>
+    </w:p>
+    <w:bookmarkEnd w:id="52"/>
+    <w:bookmarkStart w:id="53" w:name="sec-ipam-delegation"/>
+    <w:p>
+      <w:pPr>
+        <w:pStyle w:val="Heading3"/>
+      </w:pPr>
+      <w:r>
+        <w:t xml:space="preserve">3.3 Least-Privilege Role Delegation</w:t>
+      </w:r>
+    </w:p>
+    <w:p>
+      <w:pPr>
+        <w:pStyle w:val="FirstParagraph"/>
+      </w:pPr>
+      <w:r>
+        <w:t xml:space="preserve">The Grid Master holds total administrative authority over DNS, DHCP, and IPAM. That authority</w:t>
+      </w:r>
+      <w:r>
+        <w:t xml:space="preserve"> </w:t>
+      </w:r>
+      <w:r>
+        <w:rPr>
+          <w:b/>
+          <w:bCs/>
+        </w:rPr>
+        <w:t xml:space="preserve">must not reside in a single operational role</w:t>
+      </w:r>
+      <w:r>
+        <w:t xml:space="preserve">. SSA should structure InfoBlox administrative access as four delegated function areas, each assigned to the owning CIO Component with read/write access scoped only to their area:</w:t>
+      </w:r>
+    </w:p>
+    <w:p>
+      <w:pPr>
+        <w:pStyle w:val="TableCaption"/>
+      </w:pPr>
+      <w:r>
+        <w:t xml:space="preserve">InfoBlox Least-Privilege Role Delegation</w:t>
+      </w:r>
+    </w:p>
+    <w:tbl>
+      <w:tblPr>
+        <w:tblStyle w:val="Table"/>
+        <w:tblW w:type="pct" w:w="5000"/>
+        <w:tblLayout w:type="fixed"/>
+        <w:tblLook w:firstRow="1" w:lastRow="0" w:firstColumn="0" w:lastColumn="0" w:noHBand="0" w:noVBand="0" w:val="0020"/>
+        <w:tblCaption w:val="InfoBlox Least-Privilege Role Delegation"/>
+      </w:tblPr>
+      <w:tblGrid>
+        <w:gridCol w:w="1980"/>
+        <w:gridCol w:w="1980"/>
+        <w:gridCol w:w="1980"/>
+        <w:gridCol w:w="1980"/>
+      </w:tblGrid>
+      <w:tr>
+        <w:trPr>
+          <w:tblHeader w:val="on"/>
+        </w:trPr>
+        <w:tc>
+          <w:tcPr/>
+          <w:p>
+            <w:pPr>
+              <w:pStyle w:val="Compact"/>
+            </w:pPr>
+            <w:r>
+              <w:t xml:space="preserve">Function</w:t>
+            </w:r>
+          </w:p>
+        </w:tc>
+        <w:tc>
+          <w:tcPr/>
+          <w:p>
+            <w:pPr>
+              <w:pStyle w:val="Compact"/>
+            </w:pPr>
+            <w:r>
+              <w:t xml:space="preserve">Delegated To</w:t>
+            </w:r>
+          </w:p>
+        </w:tc>
+        <w:tc>
+          <w:tcPr/>
+          <w:p>
+            <w:pPr>
+              <w:pStyle w:val="Compact"/>
+            </w:pPr>
+            <w:r>
+              <w:t xml:space="preserve">Scope</w:t>
+            </w:r>
+          </w:p>
+        </w:tc>
+        <w:tc>
+          <w:tcPr/>
+          <w:p>
+            <w:pPr>
+              <w:pStyle w:val="Compact"/>
+            </w:pPr>
+            <w:r>
+              <w:t xml:space="preserve">Cannot Access</w:t>
+            </w:r>
+          </w:p>
+        </w:tc>
+      </w:tr>
+      <w:tr>
+        <w:tc>
+          <w:tcPr/>
+          <w:p>
+            <w:pPr>
+              <w:pStyle w:val="Compact"/>
+            </w:pPr>
+            <w:r>
+              <w:rPr>
+                <w:b/>
+                <w:bCs/>
+              </w:rPr>
+              <w:t xml:space="preserve">DNS zone management</w:t>
+            </w:r>
+          </w:p>
+        </w:tc>
+        <w:tc>
+          <w:tcPr/>
+          <w:p>
+            <w:pPr>
+              <w:pStyle w:val="Compact"/>
+            </w:pPr>
+            <w:r>
+              <w:t xml:space="preserve">Network / DNS Team</w:t>
+            </w:r>
+          </w:p>
+        </w:tc>
+        <w:tc>
+          <w:tcPr/>
+          <w:p>
+            <w:pPr>
+              <w:pStyle w:val="Compact"/>
+            </w:pPr>
+            <w:r>
+              <w:t xml:space="preserve">Read/write on assigned DNS zones; DNSSEC key custody shared with OIS</w:t>
+            </w:r>
+          </w:p>
+        </w:tc>
+        <w:tc>
+          <w:tcPr/>
+          <w:p>
+            <w:pPr>
+              <w:pStyle w:val="Compact"/>
+            </w:pPr>
+            <w:r>
+              <w:t xml:space="preserve">Other CIO Component zones; DHCP config; SCEP triggers</w:t>
+            </w:r>
+          </w:p>
+        </w:tc>
+      </w:tr>
+      <w:tr>
+        <w:tc>
+          <w:tcPr/>
+          <w:p>
+            <w:pPr>
+              <w:pStyle w:val="Compact"/>
+            </w:pPr>
+            <w:r>
+              <w:rPr>
+                <w:b/>
+                <w:bCs/>
+              </w:rPr>
+              <w:t xml:space="preserve">DHCP scope management</w:t>
+            </w:r>
+          </w:p>
+        </w:tc>
+        <w:tc>
+          <w:tcPr/>
+          <w:p>
+            <w:pPr>
+              <w:pStyle w:val="Compact"/>
+            </w:pPr>
+            <w:r>
+              <w:t xml:space="preserve">Network Infrastructure Team</w:t>
+            </w:r>
+          </w:p>
+        </w:tc>
+        <w:tc>
+          <w:tcPr/>
+          <w:p>
+            <w:pPr>
+              <w:pStyle w:val="Compact"/>
+            </w:pPr>
+            <w:r>
+              <w:t xml:space="preserve">Read/write on assigned IP subnets and DHCP scopes</w:t>
+            </w:r>
+          </w:p>
+        </w:tc>
+        <w:tc>
+          <w:tcPr/>
+          <w:p>
+            <w:pPr>
+              <w:pStyle w:val="Compact"/>
+            </w:pPr>
+            <w:r>
+              <w:t xml:space="preserve">DNS zone records; other teams’ subnets; SCEP policy</w:t>
+            </w:r>
+          </w:p>
+        </w:tc>
+      </w:tr>
+      <w:tr>
+        <w:tc>
+          <w:tcPr/>
+          <w:p>
+            <w:pPr>
+              <w:pStyle w:val="Compact"/>
+            </w:pPr>
+            <w:r>
+              <w:rPr>
+                <w:b/>
+                <w:bCs/>
+              </w:rPr>
+              <w:t xml:space="preserve">SCEP / cert binding</w:t>
+            </w:r>
+          </w:p>
+        </w:tc>
+        <w:tc>
+          <w:tcPr/>
+          <w:p>
+            <w:pPr>
+              <w:pStyle w:val="Compact"/>
+            </w:pPr>
+            <w:r>
+              <w:t xml:space="preserve">OIS / PKI Team</w:t>
+            </w:r>
+          </w:p>
+        </w:tc>
+        <w:tc>
+          <w:tcPr/>
+          <w:p>
+            <w:pPr>
+              <w:pStyle w:val="Compact"/>
+            </w:pPr>
+            <w:r>
+              <w:t xml:space="preserve">Trigger SCEP enrollment at A-record creation; bind cert CN to DNS FQDN</w:t>
+            </w:r>
+          </w:p>
+        </w:tc>
+        <w:tc>
+          <w:tcPr/>
+          <w:p>
+            <w:pPr>
+              <w:pStyle w:val="Compact"/>
+            </w:pPr>
+            <w:r>
+              <w:t xml:space="preserve">Zone configuration; DHCP scopes; other teams’ cert policies</w:t>
+            </w:r>
+          </w:p>
+        </w:tc>
+      </w:tr>
+      <w:tr>
+        <w:tc>
+          <w:tcPr/>
+          <w:p>
+            <w:pPr>
+              <w:pStyle w:val="Compact"/>
+            </w:pPr>
+            <w:r>
+              <w:rPr>
+                <w:b/>
+                <w:bCs/>
+              </w:rPr>
+              <w:t xml:space="preserve">Cloud Grid Member management</w:t>
+            </w:r>
+          </w:p>
+        </w:tc>
+        <w:tc>
+          <w:tcPr/>
+          <w:p>
+            <w:pPr>
+              <w:pStyle w:val="Compact"/>
+            </w:pPr>
+            <w:r>
+              <w:t xml:space="preserve">Per-environment Cloud Infra Teams (AWS GovCloud, Azure Government, OCI)</w:t>
+            </w:r>
+          </w:p>
+        </w:tc>
+        <w:tc>
+          <w:tcPr/>
+          <w:p>
+            <w:pPr>
+              <w:pStyle w:val="Compact"/>
+            </w:pPr>
+            <w:r>
+              <w:t xml:space="preserve">Configure local Grid Member for assigned cloud environment</w:t>
+            </w:r>
+          </w:p>
+        </w:tc>
+        <w:tc>
+          <w:tcPr/>
+          <w:p>
+            <w:pPr>
+              <w:pStyle w:val="Compact"/>
+            </w:pPr>
+            <w:r>
+              <w:t xml:space="preserve">Grid Master policy; other environments’ Grid Members</w:t>
+            </w:r>
+          </w:p>
+        </w:tc>
+      </w:tr>
+      <w:tr>
+        <w:tc>
+          <w:tcPr/>
+          <w:p>
+            <w:pPr>
+              <w:pStyle w:val="Compact"/>
+            </w:pPr>
+            <w:r>
+              <w:rPr>
+                <w:b/>
+                <w:bCs/>
+              </w:rPr>
+              <w:t xml:space="preserve">Grid Admin (full authority)</w:t>
+            </w:r>
+          </w:p>
+        </w:tc>
+        <w:tc>
+          <w:tcPr/>
+          <w:p>
+            <w:pPr>
+              <w:pStyle w:val="Compact"/>
+            </w:pPr>
+            <w:r>
+              <w:t xml:space="preserve">CIO/OIS-designated Grid Administrator</w:t>
+            </w:r>
+          </w:p>
+        </w:tc>
+        <w:tc>
+          <w:tcPr/>
+          <w:p>
+            <w:pPr>
+              <w:pStyle w:val="Compact"/>
+            </w:pPr>
+            <w:r>
+              <w:t xml:space="preserve">Full DDI policy control</w:t>
+            </w:r>
+          </w:p>
+        </w:tc>
+        <w:tc>
+          <w:tcPr/>
+          <w:p>
+            <w:pPr>
+              <w:pStyle w:val="Compact"/>
+            </w:pPr>
+            <w:r>
+              <w:t xml:space="preserve">— (must be protected with MFA + privileged access workstation)</w:t>
+            </w:r>
+          </w:p>
+        </w:tc>
+      </w:tr>
+    </w:tbl>
+    <w:p>
+      <w:pPr>
+        <w:pStyle w:val="BodyText"/>
+      </w:pPr>
+      <w:r>
+        <w:rPr>
+          <w:b/>
+          <w:bCs/>
+        </w:rPr>
+        <w:t xml:space="preserve">DNS function separation applies to sub-functions as well.</w:t>
+      </w:r>
+      <w:r>
+        <w:t xml:space="preserve"> </w:t>
+      </w:r>
+      <w:r>
+        <w:t xml:space="preserve">Within DNS zone management, component-level zone delegation allows different CIO Components to own their sub-namespaces:</w:t>
+      </w:r>
+    </w:p>
+    <w:p>
+      <w:pPr>
+        <w:pStyle w:val="Compact"/>
+        <w:numPr>
+          <w:ilvl w:val="0"/>
+          <w:numId w:val="1004"/>
+        </w:numPr>
+      </w:pPr>
+      <w:r>
+        <w:rPr>
+          <w:rStyle w:val="VerbatimChar"/>
+        </w:rPr>
+        <w:t xml:space="preserve">aws.ssa.gov</w:t>
+      </w:r>
+      <w:r>
+        <w:t xml:space="preserve"> </w:t>
+      </w:r>
+      <w:r>
+        <w:t xml:space="preserve">sub-zone — delegated to Cloud Infrastructure team (AWS)</w:t>
+      </w:r>
+    </w:p>
+    <w:p>
+      <w:pPr>
+        <w:pStyle w:val="Compact"/>
+        <w:numPr>
+          <w:ilvl w:val="0"/>
+          <w:numId w:val="1004"/>
+        </w:numPr>
+      </w:pPr>
+      <w:r>
+        <w:rPr>
+          <w:rStyle w:val="VerbatimChar"/>
+        </w:rPr>
+        <w:t xml:space="preserve">azure.ssa.gov</w:t>
+      </w:r>
+      <w:r>
+        <w:t xml:space="preserve"> </w:t>
+      </w:r>
+      <w:r>
+        <w:t xml:space="preserve">sub-zone — delegated to Cloud Infrastructure team (Azure)</w:t>
+      </w:r>
+    </w:p>
+    <w:p>
+      <w:pPr>
+        <w:pStyle w:val="Compact"/>
+        <w:numPr>
+          <w:ilvl w:val="0"/>
+          <w:numId w:val="1004"/>
+        </w:numPr>
+      </w:pPr>
+      <w:r>
+        <w:rPr>
+          <w:rStyle w:val="VerbatimChar"/>
+        </w:rPr>
+        <w:t xml:space="preserve">oci.ssa.gov</w:t>
+      </w:r>
+      <w:r>
+        <w:t xml:space="preserve"> </w:t>
+      </w:r>
+      <w:r>
+        <w:t xml:space="preserve">sub-zone — delegated to Cloud Infrastructure team (OCI)</w:t>
+      </w:r>
+    </w:p>
+    <w:p>
+      <w:pPr>
+        <w:pStyle w:val="Compact"/>
+        <w:numPr>
+          <w:ilvl w:val="0"/>
+          <w:numId w:val="1004"/>
+        </w:numPr>
+      </w:pPr>
+      <w:r>
+        <w:rPr>
+          <w:rStyle w:val="VerbatimChar"/>
+        </w:rPr>
+        <w:t xml:space="preserve">onprem.ssa.gov</w:t>
+      </w:r>
+      <w:r>
+        <w:t xml:space="preserve"> </w:t>
+      </w:r>
+      <w:r>
+        <w:t xml:space="preserve">sub-zone — delegated to on-premises Network Infrastructure team</w:t>
+      </w:r>
+    </w:p>
+    <w:p>
+      <w:pPr>
+        <w:pStyle w:val="Compact"/>
+        <w:numPr>
+          <w:ilvl w:val="0"/>
+          <w:numId w:val="1004"/>
+        </w:numPr>
+      </w:pPr>
+      <w:r>
+        <w:rPr>
+          <w:rStyle w:val="VerbatimChar"/>
+        </w:rPr>
+        <w:t xml:space="preserve">apps.ssa.gov</w:t>
+      </w:r>
+      <w:r>
+        <w:t xml:space="preserve"> </w:t>
+      </w:r>
+      <w:r>
+        <w:t xml:space="preserve">sub-zone — delegated to Application Development / DevOps</w:t>
+      </w:r>
+    </w:p>
+    <w:p>
+      <w:pPr>
+        <w:pStyle w:val="FirstParagraph"/>
+      </w:pPr>
+      <w:r>
+        <w:t xml:space="preserve">Each delegated zone owner can create, modify, and delete records within their zone without touching any other component’s DNS namespace. The Grid Master enforces zone-level access control; cross-zone queries still resolve via Grid Member forwarding, but record modification rights are strictly scoped.</w:t>
+      </w:r>
+    </w:p>
+    <w:bookmarkEnd w:id="53"/>
+    <w:bookmarkStart w:id="66" w:name="sec-microsoft"/>
+    <w:p>
+      <w:pPr>
+        <w:pStyle w:val="Heading3"/>
+      </w:pPr>
+      <w:r>
+        <w:t xml:space="preserve">3.4 Microsoft Partnership: M365 GCC Endpoint Lifecycle</w:t>
+      </w:r>
+    </w:p>
+    <w:p>
+      <w:pPr>
+        <w:pStyle w:val="CaptionedFigure"/>
+      </w:pPr>
+      <w:r>
+        <w:drawing>
+          <wp:inline>
+            <wp:extent cx="5334000" cy="3022600"/>
+            <wp:effectExtent b="0" l="0" r="0" t="0"/>
+            <wp:docPr descr="Microsoft × InfoBlox Technology Partnership — Six Integration Points" title="" id="55" name="Picture"/>
+            <a:graphic>
+              <a:graphicData uri="http://schemas.openxmlformats.org/drawingml/2006/picture">
+                <pic:pic>
+                  <pic:nvPicPr>
+                    <pic:cNvPr descr="figs/lz-fig-03-ms-partnership.png" id="56" name="Picture"/>
+                    <pic:cNvPicPr>
+                      <a:picLocks noChangeArrowheads="1" noChangeAspect="1"/>
+                    </pic:cNvPicPr>
+                  </pic:nvPicPr>
+                  <pic:blipFill>
+                    <a:blip r:embed="rId54"/>
                     <a:stretch>
                       <a:fillRect/>
                     </a:stretch>
@@ -2326,13 +3376,13 @@
         </w:tc>
       </w:tr>
     </w:tbl>
-    <w:bookmarkStart w:id="53" w:name="m365-gcc-boundary-enforcement"/>
+    <w:bookmarkStart w:id="65" w:name="m365-gcc-boundary-enforcement"/>
     <w:p>
       <w:pPr>
         <w:pStyle w:val="Heading4"/>
       </w:pPr>
       <w:r>
-        <w:t xml:space="preserve">3.2.1 M365 GCC Boundary Enforcement</w:t>
+        <w:t xml:space="preserve">3.4.1 M365 GCC Boundary Enforcement</w:t>
       </w:r>
     </w:p>
     <w:p>
@@ -2344,18 +3394,18 @@
           <wp:inline>
             <wp:extent cx="5334000" cy="2963333"/>
             <wp:effectExtent b="0" l="0" r="0" t="0"/>
-            <wp:docPr descr="M365 GCC Boundary Gap: Manual vs. Automated Enforcement" title="" id="45" name="Picture"/>
+            <wp:docPr descr="M365 GCC Boundary Gap: Manual vs. Automated Enforcement" title="" id="58" name="Picture"/>
             <a:graphic>
               <a:graphicData uri="http://schemas.openxmlformats.org/drawingml/2006/picture">
                 <pic:pic>
                   <pic:nvPicPr>
-                    <pic:cNvPr descr="figs/lz-fig-13-boundary-gap.png" id="46" name="Picture"/>
+                    <pic:cNvPr descr="figs/lz-fig-13-boundary-gap.png" id="59" name="Picture"/>
                     <pic:cNvPicPr>
                       <a:picLocks noChangeArrowheads="1" noChangeAspect="1"/>
                     </pic:cNvPicPr>
                   </pic:nvPicPr>
                   <pic:blipFill>
-                    <a:blip r:embed="rId44"/>
+                    <a:blip r:embed="rId57"/>
                     <a:stretch>
                       <a:fillRect/>
                     </a:stretch>
@@ -2399,18 +3449,18 @@
           <wp:inline>
             <wp:extent cx="5334000" cy="2578100"/>
             <wp:effectExtent b="0" l="0" r="0" t="0"/>
-            <wp:docPr descr="M365 GCC Endpoint Lifecycle Automation — One Poll, Four Enforcement Updates" title="" id="48" name="Picture"/>
+            <wp:docPr descr="M365 GCC Endpoint Lifecycle Automation — One Poll, Four Enforcement Updates" title="" id="61" name="Picture"/>
             <a:graphic>
               <a:graphicData uri="http://schemas.openxmlformats.org/drawingml/2006/picture">
                 <pic:pic>
                   <pic:nvPicPr>
-                    <pic:cNvPr descr="figs/lz-fig-04-m365-pipeline.png" id="49" name="Picture"/>
+                    <pic:cNvPr descr="figs/lz-fig-04-m365-pipeline.png" id="62" name="Picture"/>
                     <pic:cNvPicPr>
                       <a:picLocks noChangeArrowheads="1" noChangeAspect="1"/>
                     </pic:cNvPicPr>
                   </pic:nvPicPr>
                   <pic:blipFill>
-                    <a:blip r:embed="rId47"/>
+                    <a:blip r:embed="rId60"/>
                     <a:stretch>
                       <a:fillRect/>
                     </a:stretch>
@@ -2479,7 +3529,7 @@
         <w:pStyle w:val="Compact"/>
         <w:numPr>
           <w:ilvl w:val="0"/>
-          <w:numId w:val="1003"/>
+          <w:numId w:val="1005"/>
         </w:numPr>
       </w:pPr>
       <w:r>
@@ -2501,7 +3551,7 @@
         <w:pStyle w:val="Compact"/>
         <w:numPr>
           <w:ilvl w:val="0"/>
-          <w:numId w:val="1003"/>
+          <w:numId w:val="1005"/>
         </w:numPr>
       </w:pPr>
       <w:r>
@@ -2523,7 +3573,7 @@
         <w:pStyle w:val="Compact"/>
         <w:numPr>
           <w:ilvl w:val="0"/>
-          <w:numId w:val="1003"/>
+          <w:numId w:val="1005"/>
         </w:numPr>
       </w:pPr>
       <w:r>
@@ -2545,7 +3595,7 @@
         <w:pStyle w:val="Compact"/>
         <w:numPr>
           <w:ilvl w:val="0"/>
-          <w:numId w:val="1003"/>
+          <w:numId w:val="1005"/>
         </w:numPr>
       </w:pPr>
       <w:r>
@@ -2567,7 +3617,7 @@
         <w:pStyle w:val="Compact"/>
         <w:numPr>
           <w:ilvl w:val="0"/>
-          <w:numId w:val="1003"/>
+          <w:numId w:val="1005"/>
         </w:numPr>
       </w:pPr>
       <w:r>
@@ -2589,7 +3639,7 @@
         <w:pStyle w:val="Compact"/>
         <w:numPr>
           <w:ilvl w:val="0"/>
-          <w:numId w:val="1003"/>
+          <w:numId w:val="1005"/>
         </w:numPr>
       </w:pPr>
       <w:r>
@@ -2611,7 +3661,7 @@
         <w:pStyle w:val="Compact"/>
         <w:numPr>
           <w:ilvl w:val="0"/>
-          <w:numId w:val="1003"/>
+          <w:numId w:val="1005"/>
         </w:numPr>
       </w:pPr>
       <w:r>
@@ -2669,18 +3719,18 @@
                 <wp:inline>
                   <wp:extent cx="152400" cy="152400"/>
                   <wp:effectExtent b="0" l="0" r="0" t="0"/>
-                  <wp:docPr descr="" title="" id="51" name="Picture"/>
+                  <wp:docPr descr="" title="" id="63" name="Picture"/>
                   <a:graphic>
                     <a:graphicData uri="http://schemas.openxmlformats.org/drawingml/2006/picture">
                       <pic:pic>
                         <pic:nvPicPr>
-                          <pic:cNvPr descr="/opt/quarto/share/formats/docx/warning.png" id="52" name="Picture"/>
+                          <pic:cNvPr descr="/opt/quarto/share/formats/docx/warning.png" id="64" name="Picture"/>
                           <pic:cNvPicPr>
                             <a:picLocks noChangeArrowheads="1" noChangeAspect="1"/>
                           </pic:cNvPicPr>
                         </pic:nvPicPr>
                         <pic:blipFill>
-                          <a:blip r:embed="rId50"/>
+                          <a:blip r:embed="rId9"/>
                           <a:stretch>
                             <a:fillRect/>
                           </a:stretch>
@@ -2754,15 +3804,15 @@
         </w:tc>
       </w:tr>
     </w:tbl>
-    <w:bookmarkEnd w:id="53"/>
-    <w:bookmarkEnd w:id="54"/>
-    <w:bookmarkStart w:id="63" w:name="sec-aws"/>
+    <w:bookmarkEnd w:id="65"/>
+    <w:bookmarkEnd w:id="66"/>
+    <w:bookmarkStart w:id="75" w:name="sec-aws"/>
     <w:p>
       <w:pPr>
         <w:pStyle w:val="Heading3"/>
       </w:pPr>
       <w:r>
-        <w:t xml:space="preserve">3.3 AWS Partnership: BloxOne Runs ON AWS GovCloud</w:t>
+        <w:t xml:space="preserve">3.5 AWS Partnership: BloxOne Runs ON AWS GovCloud</w:t>
       </w:r>
     </w:p>
     <w:p>
@@ -2774,18 +3824,18 @@
           <wp:inline>
             <wp:extent cx="5334000" cy="2844800"/>
             <wp:effectExtent b="0" l="0" r="0" t="0"/>
-            <wp:docPr descr="AWS GovCloud × InfoBlox — BloxOne DDI Federal Hosted on AWS, LZA DNS Alignment" title="" id="56" name="Picture"/>
+            <wp:docPr descr="AWS GovCloud × InfoBlox — BloxOne DDI Federal Hosted on AWS, LZA DNS Alignment" title="" id="68" name="Picture"/>
             <a:graphic>
               <a:graphicData uri="http://schemas.openxmlformats.org/drawingml/2006/picture">
                 <pic:pic>
                   <pic:nvPicPr>
-                    <pic:cNvPr descr="figs/lz-fig-07-aws-lza.png" id="57" name="Picture"/>
+                    <pic:cNvPr descr="figs/lz-fig-07-aws-lza.png" id="69" name="Picture"/>
                     <pic:cNvPicPr>
                       <a:picLocks noChangeArrowheads="1" noChangeAspect="1"/>
                     </pic:cNvPicPr>
                   </pic:nvPicPr>
                   <pic:blipFill>
-                    <a:blip r:embed="rId55"/>
+                    <a:blip r:embed="rId67"/>
                     <a:stretch>
                       <a:fillRect/>
                     </a:stretch>
@@ -2885,18 +3935,18 @@
                 <wp:inline>
                   <wp:extent cx="152400" cy="152400"/>
                   <wp:effectExtent b="0" l="0" r="0" t="0"/>
-                  <wp:docPr descr="" title="" id="58" name="Picture"/>
+                  <wp:docPr descr="" title="" id="70" name="Picture"/>
                   <a:graphic>
                     <a:graphicData uri="http://schemas.openxmlformats.org/drawingml/2006/picture">
                       <pic:pic>
                         <pic:nvPicPr>
-                          <pic:cNvPr descr="/opt/quarto/share/formats/docx/tip.png" id="59" name="Picture"/>
+                          <pic:cNvPr descr="/opt/quarto/share/formats/docx/tip.png" id="71" name="Picture"/>
                           <pic:cNvPicPr>
                             <a:picLocks noChangeArrowheads="1" noChangeAspect="1"/>
                           </pic:cNvPicPr>
                         </pic:nvPicPr>
                         <pic:blipFill>
-                          <a:blip r:embed="rId32"/>
+                          <a:blip r:embed="rId35"/>
                           <a:stretch>
                             <a:fillRect/>
                           </a:stretch>
@@ -2983,7 +4033,7 @@
         <w:pStyle w:val="Compact"/>
         <w:numPr>
           <w:ilvl w:val="0"/>
-          <w:numId w:val="1004"/>
+          <w:numId w:val="1006"/>
         </w:numPr>
       </w:pPr>
       <w:r>
@@ -3005,7 +4055,7 @@
         <w:pStyle w:val="Compact"/>
         <w:numPr>
           <w:ilvl w:val="0"/>
-          <w:numId w:val="1004"/>
+          <w:numId w:val="1006"/>
         </w:numPr>
       </w:pPr>
       <w:r>
@@ -3027,7 +4077,7 @@
         <w:pStyle w:val="Compact"/>
         <w:numPr>
           <w:ilvl w:val="0"/>
-          <w:numId w:val="1004"/>
+          <w:numId w:val="1006"/>
         </w:numPr>
       </w:pPr>
       <w:r>
@@ -3049,7 +4099,7 @@
         <w:pStyle w:val="Compact"/>
         <w:numPr>
           <w:ilvl w:val="0"/>
-          <w:numId w:val="1004"/>
+          <w:numId w:val="1006"/>
         </w:numPr>
       </w:pPr>
       <w:r>
@@ -3071,7 +4121,7 @@
         <w:pStyle w:val="Compact"/>
         <w:numPr>
           <w:ilvl w:val="0"/>
-          <w:numId w:val="1004"/>
+          <w:numId w:val="1006"/>
         </w:numPr>
       </w:pPr>
       <w:r>
@@ -3129,18 +4179,18 @@
                 <wp:inline>
                   <wp:extent cx="152400" cy="152400"/>
                   <wp:effectExtent b="0" l="0" r="0" t="0"/>
-                  <wp:docPr descr="" title="" id="61" name="Picture"/>
+                  <wp:docPr descr="" title="" id="73" name="Picture"/>
                   <a:graphic>
                     <a:graphicData uri="http://schemas.openxmlformats.org/drawingml/2006/picture">
                       <pic:pic>
                         <pic:nvPicPr>
-                          <pic:cNvPr descr="/opt/quarto/share/formats/docx/note.png" id="62" name="Picture"/>
+                          <pic:cNvPr descr="/opt/quarto/share/formats/docx/note.png" id="74" name="Picture"/>
                           <pic:cNvPicPr>
                             <a:picLocks noChangeArrowheads="1" noChangeAspect="1"/>
                           </pic:cNvPicPr>
                         </pic:nvPicPr>
                         <pic:blipFill>
-                          <a:blip r:embed="rId60"/>
+                          <a:blip r:embed="rId72"/>
                           <a:stretch>
                             <a:fillRect/>
                           </a:stretch>
@@ -3230,14 +4280,14 @@
         </w:tc>
       </w:tr>
     </w:tbl>
-    <w:bookmarkEnd w:id="63"/>
-    <w:bookmarkStart w:id="69" w:name="sec-oracle"/>
+    <w:bookmarkEnd w:id="75"/>
+    <w:bookmarkStart w:id="81" w:name="sec-oracle"/>
     <w:p>
       <w:pPr>
         <w:pStyle w:val="Heading3"/>
       </w:pPr>
       <w:r>
-        <w:t xml:space="preserve">3.4 Oracle Cloud / OCI: OPM HRIT Future Integration</w:t>
+        <w:t xml:space="preserve">3.6 Oracle Cloud / OCI: OPM HRIT Future Integration</w:t>
       </w:r>
     </w:p>
     <w:p>
@@ -3249,18 +4299,18 @@
           <wp:inline>
             <wp:extent cx="5334000" cy="2933700"/>
             <wp:effectExtent b="0" l="0" r="0" t="0"/>
-            <wp:docPr descr="OPM HRIT on Oracle OCI — SSA Inter-Agency Integration via InfoBlox Certificate Monitor" title="" id="65" name="Picture"/>
+            <wp:docPr descr="OPM HRIT on Oracle OCI — SSA Inter-Agency Integration via InfoBlox Certificate Monitor" title="" id="77" name="Picture"/>
             <a:graphic>
               <a:graphicData uri="http://schemas.openxmlformats.org/drawingml/2006/picture">
                 <pic:pic>
                   <pic:nvPicPr>
-                    <pic:cNvPr descr="figs/lz-fig-06-opm-hrit.png" id="66" name="Picture"/>
+                    <pic:cNvPr descr="figs/lz-fig-06-opm-hrit.png" id="78" name="Picture"/>
                     <pic:cNvPicPr>
                       <a:picLocks noChangeArrowheads="1" noChangeAspect="1"/>
                     </pic:cNvPicPr>
                   </pic:nvPicPr>
                   <pic:blipFill>
-                    <a:blip r:embed="rId64"/>
+                    <a:blip r:embed="rId76"/>
                     <a:stretch>
                       <a:fillRect/>
                     </a:stretch>
@@ -3565,18 +4615,18 @@
                 <wp:inline>
                   <wp:extent cx="152400" cy="152400"/>
                   <wp:effectExtent b="0" l="0" r="0" t="0"/>
-                  <wp:docPr descr="" title="" id="67" name="Picture"/>
+                  <wp:docPr descr="" title="" id="79" name="Picture"/>
                   <a:graphic>
                     <a:graphicData uri="http://schemas.openxmlformats.org/drawingml/2006/picture">
                       <pic:pic>
                         <pic:nvPicPr>
-                          <pic:cNvPr descr="/opt/quarto/share/formats/docx/important.png" id="68" name="Picture"/>
+                          <pic:cNvPr descr="/opt/quarto/share/formats/docx/important.png" id="80" name="Picture"/>
                           <pic:cNvPicPr>
                             <a:picLocks noChangeArrowheads="1" noChangeAspect="1"/>
                           </pic:cNvPicPr>
                         </pic:nvPicPr>
                         <pic:blipFill>
-                          <a:blip r:embed="rId10"/>
+                          <a:blip r:embed="rId13"/>
                           <a:stretch>
                             <a:fillRect/>
                           </a:stretch>
@@ -3657,9 +4707,9 @@
         </w:pict>
       </w:r>
     </w:p>
-    <w:bookmarkEnd w:id="69"/>
-    <w:bookmarkEnd w:id="70"/>
-    <w:bookmarkStart w:id="79" w:name="sec-certs"/>
+    <w:bookmarkEnd w:id="81"/>
+    <w:bookmarkEnd w:id="82"/>
+    <w:bookmarkStart w:id="94" w:name="sec-certs"/>
     <w:p>
       <w:pPr>
         <w:pStyle w:val="Heading2"/>
@@ -3678,7 +4728,7 @@
       <w:r>
         <w:t xml:space="preserve"> </w:t>
       </w:r>
-      <w:hyperlink r:id="rId71">
+      <w:hyperlink r:id="rId83">
         <w:r>
           <w:rPr>
             <w:rStyle w:val="Hyperlink"/>
@@ -3699,18 +4749,18 @@
           <wp:inline>
             <wp:extent cx="5334000" cy="2963333"/>
             <wp:effectExtent b="0" l="0" r="0" t="0"/>
-            <wp:docPr descr="Certificate Lifecycle: Automated from IP Allocation to mTLS" title="" id="73" name="Picture"/>
+            <wp:docPr descr="Certificate Lifecycle: Automated from IP Allocation to mTLS" title="" id="85" name="Picture"/>
             <a:graphic>
               <a:graphicData uri="http://schemas.openxmlformats.org/drawingml/2006/picture">
                 <pic:pic>
                   <pic:nvPicPr>
-                    <pic:cNvPr descr="figs/lz-fig-09-cert-lifecycle.png" id="74" name="Picture"/>
+                    <pic:cNvPr descr="figs/lz-fig-09-cert-lifecycle.png" id="86" name="Picture"/>
                     <pic:cNvPicPr>
                       <a:picLocks noChangeArrowheads="1" noChangeAspect="1"/>
                     </pic:cNvPicPr>
                   </pic:nvPicPr>
                   <pic:blipFill>
-                    <a:blip r:embed="rId72"/>
+                    <a:blip r:embed="rId84"/>
                     <a:stretch>
                       <a:fillRect/>
                     </a:stretch>
@@ -3745,7 +4795,7 @@
         <w:t xml:space="preserve">Certificate Lifecycle: Automated from IP Allocation to mTLS</w:t>
       </w:r>
     </w:p>
-    <w:bookmarkStart w:id="75" w:name="sec-cert-lifecycle"/>
+    <w:bookmarkStart w:id="87" w:name="sec-cert-lifecycle"/>
     <w:p>
       <w:pPr>
         <w:pStyle w:val="Heading3"/>
@@ -3767,7 +4817,7 @@
         <w:pStyle w:val="Compact"/>
         <w:numPr>
           <w:ilvl w:val="0"/>
-          <w:numId w:val="1005"/>
+          <w:numId w:val="1007"/>
         </w:numPr>
       </w:pPr>
       <w:r>
@@ -3779,7 +4829,7 @@
         <w:pStyle w:val="Compact"/>
         <w:numPr>
           <w:ilvl w:val="0"/>
-          <w:numId w:val="1005"/>
+          <w:numId w:val="1007"/>
         </w:numPr>
       </w:pPr>
       <w:r>
@@ -3791,7 +4841,7 @@
         <w:pStyle w:val="Compact"/>
         <w:numPr>
           <w:ilvl w:val="0"/>
-          <w:numId w:val="1005"/>
+          <w:numId w:val="1007"/>
         </w:numPr>
       </w:pPr>
       <w:r>
@@ -3812,7 +4862,7 @@
         <w:pStyle w:val="Compact"/>
         <w:numPr>
           <w:ilvl w:val="0"/>
-          <w:numId w:val="1005"/>
+          <w:numId w:val="1007"/>
         </w:numPr>
       </w:pPr>
       <w:r>
@@ -3824,7 +4874,7 @@
         <w:pStyle w:val="Compact"/>
         <w:numPr>
           <w:ilvl w:val="0"/>
-          <w:numId w:val="1005"/>
+          <w:numId w:val="1007"/>
         </w:numPr>
       </w:pPr>
       <w:r>
@@ -3836,7 +4886,7 @@
         <w:pStyle w:val="Compact"/>
         <w:numPr>
           <w:ilvl w:val="0"/>
-          <w:numId w:val="1005"/>
+          <w:numId w:val="1007"/>
         </w:numPr>
       </w:pPr>
       <w:r>
@@ -3848,7 +4898,7 @@
         <w:pStyle w:val="Compact"/>
         <w:numPr>
           <w:ilvl w:val="0"/>
-          <w:numId w:val="1005"/>
+          <w:numId w:val="1007"/>
         </w:numPr>
       </w:pPr>
       <w:r>
@@ -3860,15 +4910,15 @@
         <w:pStyle w:val="Compact"/>
         <w:numPr>
           <w:ilvl w:val="0"/>
-          <w:numId w:val="1005"/>
+          <w:numId w:val="1007"/>
         </w:numPr>
       </w:pPr>
       <w:r>
         <w:t xml:space="preserve">90/30/7 days before expiry, InfoBlox Certificate Tracker generates alerts for timely renewal</w:t>
       </w:r>
     </w:p>
-    <w:bookmarkEnd w:id="75"/>
-    <w:bookmarkStart w:id="78" w:name="sec-cert-platforms"/>
+    <w:bookmarkEnd w:id="87"/>
+    <w:bookmarkStart w:id="93" w:name="sec-cert-platforms"/>
     <w:p>
       <w:pPr>
         <w:pStyle w:val="Heading3"/>
@@ -4181,18 +5231,18 @@
                 <wp:inline>
                   <wp:extent cx="152400" cy="152400"/>
                   <wp:effectExtent b="0" l="0" r="0" t="0"/>
-                  <wp:docPr descr="" title="" id="76" name="Picture"/>
+                  <wp:docPr descr="" title="" id="88" name="Picture"/>
                   <a:graphic>
                     <a:graphicData uri="http://schemas.openxmlformats.org/drawingml/2006/picture">
                       <pic:pic>
                         <pic:nvPicPr>
-                          <pic:cNvPr descr="/opt/quarto/share/formats/docx/tip.png" id="77" name="Picture"/>
+                          <pic:cNvPr descr="/opt/quarto/share/formats/docx/tip.png" id="89" name="Picture"/>
                           <pic:cNvPicPr>
                             <a:picLocks noChangeArrowheads="1" noChangeAspect="1"/>
                           </pic:cNvPicPr>
                         </pic:nvPicPr>
                         <pic:blipFill>
-                          <a:blip r:embed="rId32"/>
+                          <a:blip r:embed="rId35"/>
                           <a:stretch>
                             <a:fillRect/>
                           </a:stretch>
@@ -4279,15 +5329,327 @@
       </w:tr>
     </w:tbl>
     <w:p>
+      <w:pPr>
+        <w:pStyle w:val="BodyText"/>
+      </w:pPr>
+      <w:r>
+        <w:t xml:space="preserve"> </w:t>
+      </w:r>
+    </w:p>
+    <w:tbl>
+      <w:tblPr>
+        <w:tblStyle w:val="Table"/>
+        <w:tblLook w:firstRow="0" w:lastRow="0" w:firstColumn="0" w:lastColumn="0" w:noHBand="0" w:noVBand="0" w:val="0000"/>
+        <w:tblBorders>
+          <w:top w:val="single" w:sz="4" w:space="0" w:color="0758E5"/>
+          <w:left w:val="single" w:sz="24" w:space="0" w:color="0758E5"/>
+          <w:bottom w:val="single" w:sz="4" w:space="0" w:color="0758E5"/>
+          <w:right w:val="single" w:sz="4" w:space="0" w:color="0758E5"/>
+        </w:tblBorders>
+        <w:tblCellMar>
+          <w:left w:w="144" w:type="dxa"/>
+          <w:right w:w="144" w:type="dxa"/>
+        </w:tblCellMar>
+        <w:tblLook w:firstRow="0" w:lastRow="0" w:firstColumn="0" w:lastColumn="0" w:noHBand="0" w:noVBand="0" w:val="0000"/>
+      </w:tblPr>
+      <w:tr>
+        <w:trPr>
+          <w:cantSplit/>
+        </w:trPr>
+        <w:tc>
+          <w:tcPr>
+            <w:shd w:color="auto" w:fill="dae6fb" w:val="clear"/>
+            <w:tcMar>
+              <w:top w:w="92" w:type="dxa"/>
+              <w:bottom w:w="92" w:type="dxa"/>
+            </w:tcMar>
+          </w:tcPr>
+          <w:p>
+            <w:pPr>
+              <w:pStyle w:val="BodyText"/>
+            </w:pPr>
+            <w:pPr>
+              <w:spacing w:before="0" w:after="0"/>
+              <w:textAlignment w:val="center"/>
+            </w:pPr>
+            <w:r>
+              <w:drawing>
+                <wp:inline>
+                  <wp:extent cx="152400" cy="152400"/>
+                  <wp:effectExtent b="0" l="0" r="0" t="0"/>
+                  <wp:docPr descr="" title="" id="90" name="Picture"/>
+                  <a:graphic>
+                    <a:graphicData uri="http://schemas.openxmlformats.org/drawingml/2006/picture">
+                      <pic:pic>
+                        <pic:nvPicPr>
+                          <pic:cNvPr descr="/opt/quarto/share/formats/docx/note.png" id="91" name="Picture"/>
+                          <pic:cNvPicPr>
+                            <a:picLocks noChangeArrowheads="1" noChangeAspect="1"/>
+                          </pic:cNvPicPr>
+                        </pic:nvPicPr>
+                        <pic:blipFill>
+                          <a:blip r:embed="rId72"/>
+                          <a:stretch>
+                            <a:fillRect/>
+                          </a:stretch>
+                        </pic:blipFill>
+                        <pic:spPr bwMode="auto">
+                          <a:xfrm>
+                            <a:off x="0" y="0"/>
+                            <a:ext cx="152400" cy="152400"/>
+                          </a:xfrm>
+                          <a:prstGeom prst="rect">
+                            <a:avLst/>
+                          </a:prstGeom>
+                          <a:noFill/>
+                          <a:ln w="9525">
+                            <a:noFill/>
+                            <a:headEnd/>
+                            <a:tailEnd/>
+                          </a:ln>
+                        </pic:spPr>
+                      </pic:pic>
+                    </a:graphicData>
+                  </a:graphic>
+                </wp:inline>
+              </w:drawing>
+            </w:r>
+            <w:r>
+              <w:t xml:space="preserve"> </w:t>
+            </w:r>
+            <w:r>
+              <w:t xml:space="preserve"> </w:t>
+            </w:r>
+            <w:r>
+              <w:t xml:space="preserve">Note</w:t>
+            </w:r>
+          </w:p>
+        </w:tc>
+      </w:tr>
+      <w:tr>
+        <w:trPr>
+          <w:cantSplit/>
+        </w:trPr>
+        <w:tc>
+          <w:tcPr>
+            <w:tcMar>
+              <w:top w:w="108" w:type="dxa"/>
+              <w:bottom w:w="108" w:type="dxa"/>
+            </w:tcMar>
+          </w:tcPr>
+          <w:p>
+            <w:pPr>
+              <w:pStyle w:val="BodyText"/>
+            </w:pPr>
+            <w:pPr>
+              <w:spacing w:before="16"/>
+            </w:pPr>
+            <w:r>
+              <w:rPr>
+                <w:b/>
+                <w:bCs/>
+              </w:rPr>
+              <w:t xml:space="preserve">Cross-Book Link — NAC Endpoints and DNS/Certificate Binding (Books 02 and 03):</w:t>
+            </w:r>
+            <w:r>
+              <w:t xml:space="preserve"> </w:t>
+            </w:r>
+            <w:r>
+              <w:t xml:space="preserve">The DNS A-record + SCEP certificate compound provisioning described above applies to</w:t>
+            </w:r>
+            <w:r>
+              <w:t xml:space="preserve"> </w:t>
+            </w:r>
+            <w:r>
+              <w:rPr>
+                <w:b/>
+                <w:bCs/>
+              </w:rPr>
+              <w:t xml:space="preserve">cloud workloads</w:t>
+            </w:r>
+            <w:r>
+              <w:t xml:space="preserve"> </w:t>
+            </w:r>
+            <w:r>
+              <w:t xml:space="preserve">(VMs and containers). For</w:t>
+            </w:r>
+            <w:r>
+              <w:t xml:space="preserve"> </w:t>
+            </w:r>
+            <w:r>
+              <w:rPr>
+                <w:b/>
+                <w:bCs/>
+              </w:rPr>
+              <w:t xml:space="preserve">NAC-enrolled endpoint devices</w:t>
+            </w:r>
+            <w:r>
+              <w:t xml:space="preserve"> </w:t>
+            </w:r>
+            <w:r>
+              <w:t xml:space="preserve">— laptops, workstations, and managed endpoints that authenticate via 802.1X EAP-TLS — the same compound pattern applies but is triggered differently:</w:t>
+            </w:r>
+          </w:p>
+          <w:p>
+            <w:pPr>
+              <w:pStyle w:val="Compact"/>
+              <w:numPr>
+                <w:ilvl w:val="0"/>
+                <w:numId w:val="1008"/>
+              </w:numPr>
+            </w:pPr>
+            <w:r>
+              <w:rPr>
+                <w:b/>
+                <w:bCs/>
+              </w:rPr>
+              <w:t xml:space="preserve">Intune/SCEP enrollment</w:t>
+            </w:r>
+            <w:r>
+              <w:t xml:space="preserve"> </w:t>
+            </w:r>
+            <w:r>
+              <w:t xml:space="preserve">(covered in</w:t>
+            </w:r>
+            <w:r>
+              <w:t xml:space="preserve"> </w:t>
+            </w:r>
+            <w:hyperlink r:id="rId92">
+              <w:r>
+                <w:rPr>
+                  <w:rStyle w:val="Hyperlink"/>
+                </w:rPr>
+                <w:t xml:space="preserve">Book 02</w:t>
+              </w:r>
+            </w:hyperlink>
+            <w:r>
+              <w:t xml:space="preserve">) issues the machine certificate with</w:t>
+            </w:r>
+            <w:r>
+              <w:t xml:space="preserve"> </w:t>
+            </w:r>
+            <w:r>
+              <w:rPr>
+                <w:rStyle w:val="VerbatimChar"/>
+              </w:rPr>
+              <w:t xml:space="preserve">CN={{DeviceName}}</w:t>
+            </w:r>
+            <w:r>
+              <w:t xml:space="preserve"> </w:t>
+            </w:r>
+            <w:r>
+              <w:t xml:space="preserve">and SAN bound to the device’s Entra ID FQDN.</w:t>
+            </w:r>
+          </w:p>
+          <w:p>
+            <w:pPr>
+              <w:pStyle w:val="Compact"/>
+              <w:numPr>
+                <w:ilvl w:val="0"/>
+                <w:numId w:val="1008"/>
+              </w:numPr>
+            </w:pPr>
+            <w:r>
+              <w:rPr>
+                <w:b/>
+                <w:bCs/>
+              </w:rPr>
+              <w:t xml:space="preserve">DNS A/PTR record</w:t>
+            </w:r>
+            <w:r>
+              <w:t xml:space="preserve"> </w:t>
+            </w:r>
+            <w:r>
+              <w:t xml:space="preserve">for the endpoint should be confirmed or created in InfoBlox at DHCP lease assignment — binding the device’s DNS hostname (from Entra ID) to the DHCP-assigned IP address in the IPAM record.</w:t>
+            </w:r>
+          </w:p>
+          <w:p>
+            <w:pPr>
+              <w:pStyle w:val="Compact"/>
+              <w:numPr>
+                <w:ilvl w:val="0"/>
+                <w:numId w:val="1008"/>
+              </w:numPr>
+            </w:pPr>
+            <w:r>
+              <w:t xml:space="preserve">Together, steps 1 and 2 produce a device where</w:t>
+            </w:r>
+            <w:r>
+              <w:t xml:space="preserve"> </w:t>
+            </w:r>
+            <w:r>
+              <w:rPr>
+                <w:b/>
+                <w:bCs/>
+              </w:rPr>
+              <w:t xml:space="preserve">name, address, and key are bound at admission</w:t>
+            </w:r>
+            <w:r>
+              <w:t xml:space="preserve"> </w:t>
+            </w:r>
+            <w:r>
+              <w:t xml:space="preserve">— the same compound guarantee that workload provisioning achieves, extended to the endpoint population.</w:t>
+            </w:r>
+          </w:p>
+          <w:p>
+            <w:pPr>
+              <w:pStyle w:val="FirstParagraph"/>
+            </w:pPr>
+            <w:pPr>
+              <w:spacing w:after="16"/>
+            </w:pPr>
+            <w:r>
+              <w:t xml:space="preserve">This linkage — that every NAC-admitted device carries both a DNS hostname and a machine certificate, and that InfoBlox holds the authoritative binding record — is the shared foundation of</w:t>
+            </w:r>
+            <w:r>
+              <w:t xml:space="preserve"> </w:t>
+            </w:r>
+            <w:hyperlink r:id="rId92">
+              <w:r>
+                <w:rPr>
+                  <w:rStyle w:val="Hyperlink"/>
+                </w:rPr>
+                <w:t xml:space="preserve">Book 02</w:t>
+              </w:r>
+            </w:hyperlink>
+            <w:r>
+              <w:t xml:space="preserve"> </w:t>
+            </w:r>
+            <w:r>
+              <w:t xml:space="preserve">(NAC/802.1X) and</w:t>
+            </w:r>
+            <w:r>
+              <w:t xml:space="preserve"> </w:t>
+            </w:r>
+            <w:hyperlink r:id="rId83">
+              <w:r>
+                <w:rPr>
+                  <w:rStyle w:val="Hyperlink"/>
+                </w:rPr>
+                <w:t xml:space="preserve">Book 03</w:t>
+              </w:r>
+            </w:hyperlink>
+            <w:r>
+              <w:t xml:space="preserve"> </w:t>
+            </w:r>
+            <w:r>
+              <w:t xml:space="preserve">(Cryptographic Identity). The design decision for this binding must be validated with OIS.</w:t>
+            </w:r>
+          </w:p>
+          <w:p/>
+        </w:tc>
+      </w:tr>
+    </w:tbl>
+    <w:p>
       <w:r>
         <w:pict>
           <v:rect style="width:0;height:1.5pt" o:hralign="center" o:hrstd="t" o:hr="t"/>
         </w:pict>
       </w:r>
     </w:p>
-    <w:bookmarkEnd w:id="78"/>
-    <w:bookmarkEnd w:id="79"/>
-    <w:bookmarkStart w:id="93" w:name="sec-subdomain"/>
+    <w:bookmarkEnd w:id="93"/>
+    <w:bookmarkEnd w:id="94"/>
+    <w:bookmarkStart w:id="108" w:name="sec-subdomain"/>
     <w:p>
       <w:pPr>
         <w:pStyle w:val="Heading2"/>
@@ -4328,7 +5690,7 @@
         <w:t xml:space="preserve">— not merely a name-to-IP directory. The namespace structure determines security policy scope (which RPZ rules apply to which services), certificate coverage (what wildcards are valid and at what depth), split-horizon resolution boundaries (which records are private vs. public), and the granularity of observability (whether a DNS query log entry identifies a cloud, environment, and service from the FQDN alone). Without deliberate namespace design, the outcome is DNS sprawl, certificate chaos, and opaque logs.</w:t>
       </w:r>
     </w:p>
-    <w:bookmarkStart w:id="80" w:name="sec-subdomain-why"/>
+    <w:bookmarkStart w:id="95" w:name="sec-subdomain-why"/>
     <w:p>
       <w:pPr>
         <w:pStyle w:val="Heading3"/>
@@ -4480,8 +5842,8 @@
         <w:t xml:space="preserve">is not.</w:t>
       </w:r>
     </w:p>
-    <w:bookmarkEnd w:id="80"/>
-    <w:bookmarkStart w:id="84" w:name="sec-subdomain-structure"/>
+    <w:bookmarkEnd w:id="95"/>
+    <w:bookmarkStart w:id="99" w:name="sec-subdomain-structure"/>
     <w:p>
       <w:pPr>
         <w:pStyle w:val="Heading3"/>
@@ -4626,12 +5988,12 @@
           <wp:inline>
             <wp:extent cx="5334000" cy="2359269"/>
             <wp:effectExtent b="0" l="0" r="0" t="0"/>
-            <wp:docPr descr="SSA Subdomain Namespace Hierarchy — ssa.gov Zone Architecture" title="" id="82" name="Picture"/>
+            <wp:docPr descr="SSA Subdomain Namespace Hierarchy — ssa.gov Zone Architecture" title="" id="97" name="Picture"/>
             <a:graphic>
               <a:graphicData uri="http://schemas.openxmlformats.org/drawingml/2006/picture">
                 <pic:pic>
                   <pic:nvPicPr>
-                    <pic:cNvPr descr="figs/lz-fig-16-subdomain-hierarchy.svg" id="83" name="Picture"/>
+                    <pic:cNvPr descr="figs/lz-fig-16-subdomain-hierarchy.svg" id="98" name="Picture"/>
                     <pic:cNvPicPr>
                       <a:picLocks noChangeArrowheads="1" noChangeAspect="1"/>
                     </pic:cNvPicPr>
@@ -4643,7 +6005,7 @@
                           <a14:useLocalDpi xmlns:a14="http://schemas.microsoft.com/office/drawing/2010/main" val="0"/>
                         </a:ext>
                         <a:ext uri="{96DAC541-7B7A-43D3-8B79-37D633B846F1}">
-                          <asvg:svgBlip xmlns:asvg="http://schemas.microsoft.com/office/drawing/2016/SVG/main" r:embed="rId81"/>
+                          <asvg:svgBlip xmlns:asvg="http://schemas.microsoft.com/office/drawing/2016/SVG/main" r:embed="rId96"/>
                         </a:ext>
                       </a:extLst>
                     </a:blip>
@@ -4729,8 +6091,8 @@
         <w:t xml:space="preserve">unless geography carries an independent operational meaning (separate certificate, separate RPZ policy, separate routing). Each additional label multiplies certificate scope complexity and diagnostic friction.</w:t>
       </w:r>
     </w:p>
-    <w:bookmarkEnd w:id="84"/>
-    <w:bookmarkStart w:id="85" w:name="sec-subdomain-certs"/>
+    <w:bookmarkEnd w:id="99"/>
+    <w:bookmarkStart w:id="100" w:name="sec-subdomain-certs"/>
     <w:p>
       <w:pPr>
         <w:pStyle w:val="Heading3"/>
@@ -5080,8 +6442,8 @@
         <w:t xml:space="preserve">. The namespace zone determines the CA path; no per-workload certificate configuration is required.</w:t>
       </w:r>
     </w:p>
-    <w:bookmarkEnd w:id="85"/>
-    <w:bookmarkStart w:id="89" w:name="sec-subdomain-split"/>
+    <w:bookmarkEnd w:id="100"/>
+    <w:bookmarkStart w:id="104" w:name="sec-subdomain-split"/>
     <w:p>
       <w:pPr>
         <w:pStyle w:val="Heading3"/>
@@ -5565,12 +6927,12 @@
           <wp:inline>
             <wp:extent cx="5334000" cy="2359269"/>
             <wp:effectExtent b="0" l="0" r="0" t="0"/>
-            <wp:docPr descr="InfoBlox Split-Horizon DNS — Three-View Configuration for SSA" title="" id="87" name="Picture"/>
+            <wp:docPr descr="InfoBlox Split-Horizon DNS — Three-View Configuration for SSA" title="" id="102" name="Picture"/>
             <a:graphic>
               <a:graphicData uri="http://schemas.openxmlformats.org/drawingml/2006/picture">
                 <pic:pic>
                   <pic:nvPicPr>
-                    <pic:cNvPr descr="figs/lz-fig-17-split-horizon.svg" id="88" name="Picture"/>
+                    <pic:cNvPr descr="figs/lz-fig-17-split-horizon.svg" id="103" name="Picture"/>
                     <pic:cNvPicPr>
                       <a:picLocks noChangeArrowheads="1" noChangeAspect="1"/>
                     </pic:cNvPicPr>
@@ -5582,7 +6944,7 @@
                           <a14:useLocalDpi xmlns:a14="http://schemas.microsoft.com/office/drawing/2010/main" val="0"/>
                         </a:ext>
                         <a:ext uri="{96DAC541-7B7A-43D3-8B79-37D633B846F1}">
-                          <asvg:svgBlip xmlns:asvg="http://schemas.microsoft.com/office/drawing/2016/SVG/main" r:embed="rId86"/>
+                          <asvg:svgBlip xmlns:asvg="http://schemas.microsoft.com/office/drawing/2016/SVG/main" r:embed="rId101"/>
                         </a:ext>
                       </a:extLst>
                     </a:blip>
@@ -5620,8 +6982,8 @@
         <w:t xml:space="preserve">InfoBlox Split-Horizon DNS — Three-View Configuration for SSA</w:t>
       </w:r>
     </w:p>
-    <w:bookmarkEnd w:id="89"/>
-    <w:bookmarkStart w:id="90" w:name="sec-subdomain-iac"/>
+    <w:bookmarkEnd w:id="104"/>
+    <w:bookmarkStart w:id="105" w:name="sec-subdomain-iac"/>
     <w:p>
       <w:pPr>
         <w:pStyle w:val="Heading3"/>
@@ -6104,8 +7466,8 @@
         <w:t xml:space="preserve">pointing to the load balancer IP — created on Service creation, removed on Service deletion, with no manual DNS management required.</w:t>
       </w:r>
     </w:p>
-    <w:bookmarkEnd w:id="90"/>
-    <w:bookmarkStart w:id="91" w:name="sec-subdomain-rpz"/>
+    <w:bookmarkEnd w:id="105"/>
+    <w:bookmarkStart w:id="106" w:name="sec-subdomain-rpz"/>
     <w:p>
       <w:pPr>
         <w:pStyle w:val="Heading3"/>
@@ -6307,8 +7669,8 @@
         <w:t xml:space="preserve">that does not match the management-plane allow-list returns an RPZ NXDOMAIN before any TCP connection is attempted. The subdomain boundary is the security boundary — without it, RPZ policy must be applied at the individual record level, which is operationally unmanageable at scale.</w:t>
       </w:r>
     </w:p>
-    <w:bookmarkEnd w:id="91"/>
-    <w:bookmarkStart w:id="92" w:name="sec-subdomain-nist"/>
+    <w:bookmarkEnd w:id="106"/>
+    <w:bookmarkStart w:id="107" w:name="sec-subdomain-nist"/>
     <w:p>
       <w:pPr>
         <w:pStyle w:val="Heading3"/>
@@ -6511,9 +7873,9 @@
         </w:pict>
       </w:r>
     </w:p>
-    <w:bookmarkEnd w:id="92"/>
-    <w:bookmarkEnd w:id="93"/>
-    <w:bookmarkStart w:id="95" w:name="sec-dns-steering"/>
+    <w:bookmarkEnd w:id="107"/>
+    <w:bookmarkEnd w:id="108"/>
+    <w:bookmarkStart w:id="113" w:name="sec-dns-steering"/>
     <w:p>
       <w:pPr>
         <w:pStyle w:val="Heading2"/>
@@ -6528,6 +7890,61 @@
       </w:pPr>
       <w:r>
         <w:t xml:space="preserve">Global server load balancing has always been a DNS function wearing an appliance badge. When a hardware GSLB appliance decides which data center or cloud region answers a user’s request, the mechanism it uses is a DNS response: the appliance acts as an authoritative name server that answers the same query differently depending on endpoint health, requestor topology, and policy weight. Strip away the chassis, and what remains is health-checked, policy-driven authoritative DNS — a control-plane function of the naming and addressing layer, not a data-plane function of any appliance tier.</w:t>
+      </w:r>
+    </w:p>
+    <w:p>
+      <w:pPr>
+        <w:pStyle w:val="CaptionedFigure"/>
+      </w:pPr>
+      <w:r>
+        <w:drawing>
+          <wp:inline>
+            <wp:extent cx="5334000" cy="2667000"/>
+            <wp:effectExtent b="0" l="0" r="0" t="0"/>
+            <wp:docPr descr="InfoBlox DTC — DNS-Based Traffic Steering Across On-Premises and Multi-Cloud Endpoints" title="" id="110" name="Picture"/>
+            <a:graphic>
+              <a:graphicData uri="http://schemas.openxmlformats.org/drawingml/2006/picture">
+                <pic:pic>
+                  <pic:nvPicPr>
+                    <pic:cNvPr descr="figs/lz-fig-18-dns-traffic-steering.png" id="111" name="Picture"/>
+                    <pic:cNvPicPr>
+                      <a:picLocks noChangeArrowheads="1" noChangeAspect="1"/>
+                    </pic:cNvPicPr>
+                  </pic:nvPicPr>
+                  <pic:blipFill>
+                    <a:blip r:embed="rId109"/>
+                    <a:stretch>
+                      <a:fillRect/>
+                    </a:stretch>
+                  </pic:blipFill>
+                  <pic:spPr bwMode="auto">
+                    <a:xfrm>
+                      <a:off x="0" y="0"/>
+                      <a:ext cx="5334000" cy="2667000"/>
+                    </a:xfrm>
+                    <a:prstGeom prst="rect">
+                      <a:avLst/>
+                    </a:prstGeom>
+                    <a:noFill/>
+                    <a:ln w="9525">
+                      <a:noFill/>
+                      <a:headEnd/>
+                      <a:tailEnd/>
+                    </a:ln>
+                  </pic:spPr>
+                </pic:pic>
+              </a:graphicData>
+            </a:graphic>
+          </wp:inline>
+        </w:drawing>
+      </w:r>
+    </w:p>
+    <w:p>
+      <w:pPr>
+        <w:pStyle w:val="ImageCaption"/>
+      </w:pPr>
+      <w:r>
+        <w:t xml:space="preserve">InfoBlox DTC — DNS-Based Traffic Steering Across On-Premises and Multi-Cloud Endpoints</w:t>
       </w:r>
     </w:p>
     <w:p>
@@ -6592,7 +8009,7 @@
       <w:r>
         <w:t xml:space="preserve"> </w:t>
       </w:r>
-      <w:hyperlink r:id="rId94">
+      <w:hyperlink r:id="rId112">
         <w:r>
           <w:rPr>
             <w:rStyle w:val="Hyperlink"/>
@@ -6639,8 +8056,8 @@
         </w:pict>
       </w:r>
     </w:p>
-    <w:bookmarkEnd w:id="95"/>
-    <w:bookmarkStart w:id="98" w:name="sec-nist"/>
+    <w:bookmarkEnd w:id="113"/>
+    <w:bookmarkStart w:id="116" w:name="sec-nist"/>
     <w:p>
       <w:pPr>
         <w:pStyle w:val="Heading2"/>
@@ -7528,18 +8945,18 @@
                 <wp:inline>
                   <wp:extent cx="152400" cy="152400"/>
                   <wp:effectExtent b="0" l="0" r="0" t="0"/>
-                  <wp:docPr descr="" title="" id="96" name="Picture"/>
+                  <wp:docPr descr="" title="" id="114" name="Picture"/>
                   <a:graphic>
                     <a:graphicData uri="http://schemas.openxmlformats.org/drawingml/2006/picture">
                       <pic:pic>
                         <pic:nvPicPr>
-                          <pic:cNvPr descr="/opt/quarto/share/formats/docx/important.png" id="97" name="Picture"/>
+                          <pic:cNvPr descr="/opt/quarto/share/formats/docx/important.png" id="115" name="Picture"/>
                           <pic:cNvPicPr>
                             <a:picLocks noChangeArrowheads="1" noChangeAspect="1"/>
                           </pic:cNvPicPr>
                         </pic:nvPicPr>
                         <pic:blipFill>
-                          <a:blip r:embed="rId10"/>
+                          <a:blip r:embed="rId13"/>
                           <a:stretch>
                             <a:fillRect/>
                           </a:stretch>
@@ -7668,8 +9085,8 @@
         </w:pict>
       </w:r>
     </w:p>
-    <w:bookmarkEnd w:id="98"/>
-    <w:bookmarkStart w:id="106" w:name="sec-ztmm"/>
+    <w:bookmarkEnd w:id="116"/>
+    <w:bookmarkStart w:id="124" w:name="sec-ztmm"/>
     <w:p>
       <w:pPr>
         <w:pStyle w:val="Heading2"/>
@@ -7695,18 +9112,18 @@
           <wp:inline>
             <wp:extent cx="5334000" cy="2963333"/>
             <wp:effectExtent b="0" l="0" r="0" t="0"/>
-            <wp:docPr descr="CISA Zero Trust Maturity — Networks Pillar Progression" title="" id="100" name="Picture"/>
+            <wp:docPr descr="CISA Zero Trust Maturity — Networks Pillar Progression" title="" id="118" name="Picture"/>
             <a:graphic>
               <a:graphicData uri="http://schemas.openxmlformats.org/drawingml/2006/picture">
                 <pic:pic>
                   <pic:nvPicPr>
-                    <pic:cNvPr descr="figs/lz-fig-11-zt-staircase.png" id="101" name="Picture"/>
+                    <pic:cNvPr descr="figs/lz-fig-11-zt-staircase.png" id="119" name="Picture"/>
                     <pic:cNvPicPr>
                       <a:picLocks noChangeArrowheads="1" noChangeAspect="1"/>
                     </pic:cNvPicPr>
                   </pic:nvPicPr>
                   <pic:blipFill>
-                    <a:blip r:embed="rId99"/>
+                    <a:blip r:embed="rId117"/>
                     <a:stretch>
                       <a:fillRect/>
                     </a:stretch>
@@ -7741,7 +9158,7 @@
         <w:t xml:space="preserve">CISA Zero Trust Maturity — Networks Pillar Progression</w:t>
       </w:r>
     </w:p>
-    <w:bookmarkStart w:id="102" w:name="sec-zt-networks"/>
+    <w:bookmarkStart w:id="120" w:name="sec-zt-networks"/>
     <w:p>
       <w:pPr>
         <w:pStyle w:val="Heading3"/>
@@ -8020,8 +9437,8 @@
         </w:tc>
       </w:tr>
     </w:tbl>
-    <w:bookmarkEnd w:id="102"/>
-    <w:bookmarkStart w:id="103" w:name="sec-zt-identity"/>
+    <w:bookmarkEnd w:id="120"/>
+    <w:bookmarkStart w:id="121" w:name="sec-zt-identity"/>
     <w:p>
       <w:pPr>
         <w:pStyle w:val="Heading3"/>
@@ -8043,7 +9460,7 @@
         <w:pStyle w:val="Compact"/>
         <w:numPr>
           <w:ilvl w:val="0"/>
-          <w:numId w:val="1006"/>
+          <w:numId w:val="1009"/>
         </w:numPr>
       </w:pPr>
       <w:r>
@@ -8055,7 +9472,7 @@
         <w:pStyle w:val="Compact"/>
         <w:numPr>
           <w:ilvl w:val="0"/>
-          <w:numId w:val="1006"/>
+          <w:numId w:val="1009"/>
         </w:numPr>
       </w:pPr>
       <w:r>
@@ -8067,15 +9484,15 @@
         <w:pStyle w:val="Compact"/>
         <w:numPr>
           <w:ilvl w:val="0"/>
-          <w:numId w:val="1006"/>
+          <w:numId w:val="1009"/>
         </w:numPr>
       </w:pPr>
       <w:r>
         <w:t xml:space="preserve">Certificate expiry alerting prevents identity credential expiration — a common cause of authentication outages</w:t>
       </w:r>
     </w:p>
-    <w:bookmarkEnd w:id="103"/>
-    <w:bookmarkStart w:id="104" w:name="sec-zt-visibility"/>
+    <w:bookmarkEnd w:id="121"/>
+    <w:bookmarkStart w:id="122" w:name="sec-zt-visibility"/>
     <w:p>
       <w:pPr>
         <w:pStyle w:val="Heading3"/>
@@ -8097,7 +9514,7 @@
         <w:pStyle w:val="Compact"/>
         <w:numPr>
           <w:ilvl w:val="0"/>
-          <w:numId w:val="1007"/>
+          <w:numId w:val="1010"/>
         </w:numPr>
       </w:pPr>
       <w:r>
@@ -8119,7 +9536,7 @@
         <w:pStyle w:val="Compact"/>
         <w:numPr>
           <w:ilvl w:val="0"/>
-          <w:numId w:val="1007"/>
+          <w:numId w:val="1010"/>
         </w:numPr>
       </w:pPr>
       <w:r>
@@ -8141,7 +9558,7 @@
         <w:pStyle w:val="Compact"/>
         <w:numPr>
           <w:ilvl w:val="0"/>
-          <w:numId w:val="1007"/>
+          <w:numId w:val="1010"/>
         </w:numPr>
       </w:pPr>
       <w:r>
@@ -8166,8 +9583,8 @@
         <w:t xml:space="preserve">All three streams flow to the SIEM in consistent syslog format — enabling correlation across DNS, IP, and certificate events that individually appear innocuous but together may indicate lateral movement or data exfiltration.</w:t>
       </w:r>
     </w:p>
-    <w:bookmarkEnd w:id="104"/>
-    <w:bookmarkStart w:id="105" w:name="sec-zt-automation"/>
+    <w:bookmarkEnd w:id="122"/>
+    <w:bookmarkStart w:id="123" w:name="sec-zt-automation"/>
     <w:p>
       <w:pPr>
         <w:pStyle w:val="Heading3"/>
@@ -8189,7 +9606,7 @@
         <w:pStyle w:val="Compact"/>
         <w:numPr>
           <w:ilvl w:val="0"/>
-          <w:numId w:val="1008"/>
+          <w:numId w:val="1011"/>
         </w:numPr>
       </w:pPr>
       <w:r>
@@ -8201,7 +9618,7 @@
         <w:pStyle w:val="Compact"/>
         <w:numPr>
           <w:ilvl w:val="0"/>
-          <w:numId w:val="1008"/>
+          <w:numId w:val="1011"/>
         </w:numPr>
       </w:pPr>
       <w:r>
@@ -8213,7 +9630,7 @@
         <w:pStyle w:val="Compact"/>
         <w:numPr>
           <w:ilvl w:val="0"/>
-          <w:numId w:val="1008"/>
+          <w:numId w:val="1011"/>
         </w:numPr>
       </w:pPr>
       <w:r>
@@ -8227,9 +9644,9 @@
         </w:pict>
       </w:r>
     </w:p>
-    <w:bookmarkEnd w:id="105"/>
-    <w:bookmarkEnd w:id="106"/>
-    <w:bookmarkStart w:id="116" w:name="sec-boundary"/>
+    <w:bookmarkEnd w:id="123"/>
+    <w:bookmarkEnd w:id="124"/>
+    <w:bookmarkStart w:id="133" w:name="sec-boundary"/>
     <w:p>
       <w:pPr>
         <w:pStyle w:val="Heading2"/>
@@ -8247,18 +9664,18 @@
           <wp:inline>
             <wp:extent cx="5334000" cy="2963333"/>
             <wp:effectExtent b="0" l="0" r="0" t="0"/>
-            <wp:docPr descr="InfoBlox RPZ: The DNS-Layer FedRAMP Boundary Gate" title="" id="108" name="Picture"/>
+            <wp:docPr descr="InfoBlox RPZ: The DNS-Layer FedRAMP Boundary Gate" title="" id="126" name="Picture"/>
             <a:graphic>
               <a:graphicData uri="http://schemas.openxmlformats.org/drawingml/2006/picture">
                 <pic:pic>
                   <pic:nvPicPr>
-                    <pic:cNvPr descr="figs/lz-fig-15-rpz-gate.png" id="109" name="Picture"/>
+                    <pic:cNvPr descr="figs/lz-fig-15-rpz-gate.png" id="127" name="Picture"/>
                     <pic:cNvPicPr>
                       <a:picLocks noChangeArrowheads="1" noChangeAspect="1"/>
                     </pic:cNvPicPr>
                   </pic:nvPicPr>
                   <pic:blipFill>
-                    <a:blip r:embed="rId107"/>
+                    <a:blip r:embed="rId125"/>
                     <a:stretch>
                       <a:fillRect/>
                     </a:stretch>
@@ -8302,18 +9719,18 @@
           <wp:inline>
             <wp:extent cx="5334000" cy="3022600"/>
             <wp:effectExtent b="0" l="0" r="0" t="0"/>
-            <wp:docPr descr="InfoBlox DDI as the FedRAMP Authorization Boundary Enforcement Layer" title="" id="111" name="Picture"/>
+            <wp:docPr descr="InfoBlox DDI as the FedRAMP Authorization Boundary Enforcement Layer" title="" id="129" name="Picture"/>
             <a:graphic>
               <a:graphicData uri="http://schemas.openxmlformats.org/drawingml/2006/picture">
                 <pic:pic>
                   <pic:nvPicPr>
-                    <pic:cNvPr descr="figs/lz-fig-05-boundary.png" id="112" name="Picture"/>
+                    <pic:cNvPr descr="figs/lz-fig-05-boundary.png" id="130" name="Picture"/>
                     <pic:cNvPicPr>
                       <a:picLocks noChangeArrowheads="1" noChangeAspect="1"/>
                     </pic:cNvPicPr>
                   </pic:nvPicPr>
                   <pic:blipFill>
-                    <a:blip r:embed="rId110"/>
+                    <a:blip r:embed="rId128"/>
                     <a:stretch>
                       <a:fillRect/>
                     </a:stretch>
@@ -8447,18 +9864,18 @@
                 <wp:inline>
                   <wp:extent cx="152400" cy="152400"/>
                   <wp:effectExtent b="0" l="0" r="0" t="0"/>
-                  <wp:docPr descr="" title="" id="113" name="Picture"/>
+                  <wp:docPr descr="" title="" id="131" name="Picture"/>
                   <a:graphic>
                     <a:graphicData uri="http://schemas.openxmlformats.org/drawingml/2006/picture">
                       <pic:pic>
                         <pic:nvPicPr>
-                          <pic:cNvPr descr="/opt/quarto/share/formats/docx/important.png" id="114" name="Picture"/>
+                          <pic:cNvPr descr="/opt/quarto/share/formats/docx/important.png" id="132" name="Picture"/>
                           <pic:cNvPicPr>
                             <a:picLocks noChangeArrowheads="1" noChangeAspect="1"/>
                           </pic:cNvPicPr>
                         </pic:nvPicPr>
                         <pic:blipFill>
-                          <a:blip r:embed="rId10"/>
+                          <a:blip r:embed="rId13"/>
                           <a:stretch>
                             <a:fillRect/>
                           </a:stretch>
@@ -8543,7 +9960,7 @@
             <w:r>
               <w:t xml:space="preserve"> </w:t>
             </w:r>
-            <w:hyperlink r:id="rId115">
+            <w:hyperlink r:id="rId92">
               <w:r>
                 <w:rPr>
                   <w:rStyle w:val="Hyperlink"/>
@@ -8582,7 +9999,7 @@
         <w:pStyle w:val="Compact"/>
         <w:numPr>
           <w:ilvl w:val="0"/>
-          <w:numId w:val="1009"/>
+          <w:numId w:val="1012"/>
         </w:numPr>
       </w:pPr>
       <w:r>
@@ -8594,7 +10011,7 @@
         <w:pStyle w:val="Compact"/>
         <w:numPr>
           <w:ilvl w:val="0"/>
-          <w:numId w:val="1009"/>
+          <w:numId w:val="1012"/>
         </w:numPr>
       </w:pPr>
       <w:r>
@@ -8606,7 +10023,7 @@
         <w:pStyle w:val="Compact"/>
         <w:numPr>
           <w:ilvl w:val="0"/>
-          <w:numId w:val="1009"/>
+          <w:numId w:val="1012"/>
         </w:numPr>
       </w:pPr>
       <w:r>
@@ -8618,7 +10035,7 @@
         <w:pStyle w:val="Compact"/>
         <w:numPr>
           <w:ilvl w:val="0"/>
-          <w:numId w:val="1009"/>
+          <w:numId w:val="1012"/>
         </w:numPr>
       </w:pPr>
       <w:r>
@@ -8630,7 +10047,7 @@
         <w:pStyle w:val="Compact"/>
         <w:numPr>
           <w:ilvl w:val="0"/>
-          <w:numId w:val="1009"/>
+          <w:numId w:val="1012"/>
         </w:numPr>
       </w:pPr>
       <w:r>
@@ -8662,8 +10079,8 @@
         </w:pict>
       </w:r>
     </w:p>
-    <w:bookmarkEnd w:id="116"/>
-    <w:bookmarkStart w:id="121" w:name="sec-fedramp"/>
+    <w:bookmarkEnd w:id="133"/>
+    <w:bookmarkStart w:id="138" w:name="sec-fedramp"/>
     <w:p>
       <w:pPr>
         <w:pStyle w:val="Heading2"/>
@@ -8672,7 +10089,7 @@
         <w:t xml:space="preserve">10 FedRAMP Moderate and FedRAMP 20x Controls</w:t>
       </w:r>
     </w:p>
-    <w:bookmarkStart w:id="117" w:name="sec-fedramp-moderate"/>
+    <w:bookmarkStart w:id="134" w:name="sec-fedramp-moderate"/>
     <w:p>
       <w:pPr>
         <w:pStyle w:val="Heading3"/>
@@ -9083,8 +10500,8 @@
         </w:tc>
       </w:tr>
     </w:tbl>
-    <w:bookmarkEnd w:id="117"/>
-    <w:bookmarkStart w:id="120" w:name="sec-fedramp-20x"/>
+    <w:bookmarkEnd w:id="134"/>
+    <w:bookmarkStart w:id="137" w:name="sec-fedramp-20x"/>
     <w:p>
       <w:pPr>
         <w:pStyle w:val="Heading3"/>
@@ -9634,18 +11051,18 @@
                 <wp:inline>
                   <wp:extent cx="152400" cy="152400"/>
                   <wp:effectExtent b="0" l="0" r="0" t="0"/>
-                  <wp:docPr descr="" title="" id="118" name="Picture"/>
+                  <wp:docPr descr="" title="" id="135" name="Picture"/>
                   <a:graphic>
                     <a:graphicData uri="http://schemas.openxmlformats.org/drawingml/2006/picture">
                       <pic:pic>
                         <pic:nvPicPr>
-                          <pic:cNvPr descr="/opt/quarto/share/formats/docx/tip.png" id="119" name="Picture"/>
+                          <pic:cNvPr descr="/opt/quarto/share/formats/docx/tip.png" id="136" name="Picture"/>
                           <pic:cNvPicPr>
                             <a:picLocks noChangeArrowheads="1" noChangeAspect="1"/>
                           </pic:cNvPicPr>
                         </pic:nvPicPr>
                         <pic:blipFill>
-                          <a:blip r:embed="rId32"/>
+                          <a:blip r:embed="rId35"/>
                           <a:stretch>
                             <a:fillRect/>
                           </a:stretch>
@@ -9726,9 +11143,9 @@
         </w:pict>
       </w:r>
     </w:p>
-    <w:bookmarkEnd w:id="120"/>
-    <w:bookmarkEnd w:id="121"/>
-    <w:bookmarkStart w:id="122" w:name="sec-interagency"/>
+    <w:bookmarkEnd w:id="137"/>
+    <w:bookmarkEnd w:id="138"/>
+    <w:bookmarkStart w:id="139" w:name="sec-interagency"/>
     <w:p>
       <w:pPr>
         <w:pStyle w:val="Heading2"/>
@@ -9766,7 +11183,7 @@
         <w:pStyle w:val="Compact"/>
         <w:numPr>
           <w:ilvl w:val="0"/>
-          <w:numId w:val="1010"/>
+          <w:numId w:val="1013"/>
         </w:numPr>
       </w:pPr>
       <w:r>
@@ -9778,7 +11195,7 @@
         <w:pStyle w:val="Compact"/>
         <w:numPr>
           <w:ilvl w:val="0"/>
-          <w:numId w:val="1010"/>
+          <w:numId w:val="1013"/>
         </w:numPr>
       </w:pPr>
       <w:r>
@@ -9790,7 +11207,7 @@
         <w:pStyle w:val="Compact"/>
         <w:numPr>
           <w:ilvl w:val="0"/>
-          <w:numId w:val="1010"/>
+          <w:numId w:val="1013"/>
         </w:numPr>
       </w:pPr>
       <w:r>
@@ -9802,7 +11219,7 @@
         <w:pStyle w:val="Compact"/>
         <w:numPr>
           <w:ilvl w:val="0"/>
-          <w:numId w:val="1010"/>
+          <w:numId w:val="1013"/>
         </w:numPr>
       </w:pPr>
       <w:r>
@@ -9836,7 +11253,7 @@
         <w:pStyle w:val="Compact"/>
         <w:numPr>
           <w:ilvl w:val="0"/>
-          <w:numId w:val="1011"/>
+          <w:numId w:val="1014"/>
         </w:numPr>
       </w:pPr>
       <w:r>
@@ -9858,7 +11275,7 @@
         <w:pStyle w:val="Compact"/>
         <w:numPr>
           <w:ilvl w:val="0"/>
-          <w:numId w:val="1011"/>
+          <w:numId w:val="1014"/>
         </w:numPr>
       </w:pPr>
       <w:r>
@@ -9880,7 +11297,7 @@
         <w:pStyle w:val="Compact"/>
         <w:numPr>
           <w:ilvl w:val="0"/>
-          <w:numId w:val="1011"/>
+          <w:numId w:val="1014"/>
         </w:numPr>
       </w:pPr>
       <w:r>
@@ -9902,7 +11319,7 @@
         <w:pStyle w:val="Compact"/>
         <w:numPr>
           <w:ilvl w:val="0"/>
-          <w:numId w:val="1011"/>
+          <w:numId w:val="1014"/>
         </w:numPr>
       </w:pPr>
       <w:r>
@@ -9924,7 +11341,7 @@
         <w:pStyle w:val="Compact"/>
         <w:numPr>
           <w:ilvl w:val="0"/>
-          <w:numId w:val="1011"/>
+          <w:numId w:val="1014"/>
         </w:numPr>
       </w:pPr>
       <w:r>
@@ -9948,8 +11365,8 @@
         </w:pict>
       </w:r>
     </w:p>
-    <w:bookmarkEnd w:id="122"/>
-    <w:bookmarkStart w:id="123" w:name="sec-summary"/>
+    <w:bookmarkEnd w:id="139"/>
+    <w:bookmarkStart w:id="140" w:name="sec-summary"/>
     <w:p>
       <w:pPr>
         <w:pStyle w:val="Heading2"/>
@@ -10709,8 +12126,8 @@
         </w:pict>
       </w:r>
     </w:p>
-    <w:bookmarkEnd w:id="123"/>
-    <w:bookmarkStart w:id="134" w:name="sec-roadmap"/>
+    <w:bookmarkEnd w:id="140"/>
+    <w:bookmarkStart w:id="151" w:name="sec-roadmap"/>
     <w:p>
       <w:pPr>
         <w:pStyle w:val="Heading2"/>
@@ -10748,18 +12165,18 @@
           <wp:inline>
             <wp:extent cx="5334000" cy="3526366"/>
             <wp:effectExtent b="0" l="0" r="0" t="0"/>
-            <wp:docPr descr="InfoBlox DDI Landing Zone — Six-Phase Buildout Roadmap" title="" id="125" name="Picture"/>
+            <wp:docPr descr="InfoBlox DDI Landing Zone — Six-Phase Buildout Roadmap" title="" id="142" name="Picture"/>
             <a:graphic>
               <a:graphicData uri="http://schemas.openxmlformats.org/drawingml/2006/picture">
                 <pic:pic>
                   <pic:nvPicPr>
-                    <pic:cNvPr descr="figs/lz-fig-14-roadmap.png" id="126" name="Picture"/>
+                    <pic:cNvPr descr="figs/lz-fig-14-roadmap.png" id="143" name="Picture"/>
                     <pic:cNvPicPr>
                       <a:picLocks noChangeArrowheads="1" noChangeAspect="1"/>
                     </pic:cNvPicPr>
                   </pic:nvPicPr>
                   <pic:blipFill>
-                    <a:blip r:embed="rId124"/>
+                    <a:blip r:embed="rId141"/>
                     <a:stretch>
                       <a:fillRect/>
                     </a:stretch>
@@ -10794,7 +12211,7 @@
         <w:t xml:space="preserve">InfoBlox DDI Landing Zone — Six-Phase Buildout Roadmap</w:t>
       </w:r>
     </w:p>
-    <w:bookmarkStart w:id="127" w:name="X6998601d02e0784d9756e9b3df61efe56f843a2"/>
+    <w:bookmarkStart w:id="144" w:name="X6998601d02e0784d9756e9b3df61efe56f843a2"/>
     <w:p>
       <w:pPr>
         <w:pStyle w:val="Heading3"/>
@@ -10808,7 +12225,7 @@
         <w:pStyle w:val="Compact"/>
         <w:numPr>
           <w:ilvl w:val="0"/>
-          <w:numId w:val="1012"/>
+          <w:numId w:val="1015"/>
         </w:numPr>
       </w:pPr>
       <w:r>
@@ -10836,7 +12253,7 @@
         <w:pStyle w:val="Compact"/>
         <w:numPr>
           <w:ilvl w:val="0"/>
-          <w:numId w:val="1012"/>
+          <w:numId w:val="1015"/>
         </w:numPr>
       </w:pPr>
       <w:r>
@@ -10864,7 +12281,7 @@
         <w:pStyle w:val="Compact"/>
         <w:numPr>
           <w:ilvl w:val="0"/>
-          <w:numId w:val="1012"/>
+          <w:numId w:val="1015"/>
         </w:numPr>
       </w:pPr>
       <w:r>
@@ -10876,15 +12293,15 @@
         <w:pStyle w:val="Compact"/>
         <w:numPr>
           <w:ilvl w:val="0"/>
-          <w:numId w:val="1012"/>
+          <w:numId w:val="1015"/>
         </w:numPr>
       </w:pPr>
       <w:r>
         <w:t xml:space="preserve">Engage InfoBlox Professional Services for VCF 9.1 DDI integration workshop</w:t>
       </w:r>
     </w:p>
-    <w:bookmarkEnd w:id="127"/>
-    <w:bookmarkStart w:id="128" w:name="phase-1-on-premises-foundation-months-13"/>
+    <w:bookmarkEnd w:id="144"/>
+    <w:bookmarkStart w:id="145" w:name="phase-1-on-premises-foundation-months-13"/>
     <w:p>
       <w:pPr>
         <w:pStyle w:val="Heading3"/>
@@ -10898,7 +12315,7 @@
         <w:pStyle w:val="Compact"/>
         <w:numPr>
           <w:ilvl w:val="0"/>
-          <w:numId w:val="1013"/>
+          <w:numId w:val="1016"/>
         </w:numPr>
       </w:pPr>
       <w:r>
@@ -10910,7 +12327,7 @@
         <w:pStyle w:val="Compact"/>
         <w:numPr>
           <w:ilvl w:val="0"/>
-          <w:numId w:val="1013"/>
+          <w:numId w:val="1016"/>
         </w:numPr>
       </w:pPr>
       <w:r>
@@ -10922,7 +12339,7 @@
         <w:pStyle w:val="Compact"/>
         <w:numPr>
           <w:ilvl w:val="0"/>
-          <w:numId w:val="1013"/>
+          <w:numId w:val="1016"/>
         </w:numPr>
       </w:pPr>
       <w:r>
@@ -10931,7 +12348,7 @@
       <w:r>
         <w:t xml:space="preserve"> </w:t>
       </w:r>
-      <w:hyperlink r:id="rId115">
+      <w:hyperlink r:id="rId92">
         <w:r>
           <w:rPr>
             <w:rStyle w:val="Hyperlink"/>
@@ -10951,149 +12368,11 @@
         <w:pStyle w:val="Compact"/>
         <w:numPr>
           <w:ilvl w:val="0"/>
-          <w:numId w:val="1013"/>
+          <w:numId w:val="1016"/>
         </w:numPr>
       </w:pPr>
       <w:r>
         <w:t xml:space="preserve">Configure syslog forwarding from all Grid Members to SIEM (Splunk/Sentinel); verify AU-12 event receipt</w:t>
-      </w:r>
-    </w:p>
-    <w:p>
-      <w:pPr>
-        <w:pStyle w:val="Compact"/>
-        <w:numPr>
-          <w:ilvl w:val="0"/>
-          <w:numId w:val="1013"/>
-        </w:numPr>
-      </w:pPr>
-      <w:r>
-        <w:t xml:space="preserve">Deploy SCEP connector to ADCS; test automated cert enrollment from new IP host record</w:t>
-      </w:r>
-    </w:p>
-    <w:p>
-      <w:pPr>
-        <w:pStyle w:val="Compact"/>
-        <w:numPr>
-          <w:ilvl w:val="0"/>
-          <w:numId w:val="1013"/>
-        </w:numPr>
-      </w:pPr>
-      <w:r>
-        <w:t xml:space="preserve">Generate first CM-8 IP inventory export; reconcile against existing CMDB</w:t>
-      </w:r>
-    </w:p>
-    <w:bookmarkEnd w:id="128"/>
-    <w:bookmarkStart w:id="129" w:name="Xc4c0bc48ec731a428e8eb5363949c17466fc71f"/>
-    <w:p>
-      <w:pPr>
-        <w:pStyle w:val="Heading3"/>
-      </w:pPr>
-      <w:r>
-        <w:t xml:space="preserve">Phase 2 — VMware VCF 9.1 Integration (Months 2–4)</w:t>
-      </w:r>
-    </w:p>
-    <w:p>
-      <w:pPr>
-        <w:pStyle w:val="Compact"/>
-        <w:numPr>
-          <w:ilvl w:val="0"/>
-          <w:numId w:val="1014"/>
-        </w:numPr>
-      </w:pPr>
-      <w:r>
-        <w:t xml:space="preserve">Update VCF to 9.1; configure VCF-A to use InfoBlox WAPI as external IPAM backend</w:t>
-      </w:r>
-    </w:p>
-    <w:p>
-      <w:pPr>
-        <w:pStyle w:val="Compact"/>
-        <w:numPr>
-          <w:ilvl w:val="0"/>
-          <w:numId w:val="1014"/>
-        </w:numPr>
-      </w:pPr>
-      <w:r>
-        <w:t xml:space="preserve">Update NSX-T DHCP Server Profiles to route DNS to InfoBlox Grid Member IP</w:t>
-      </w:r>
-    </w:p>
-    <w:p>
-      <w:pPr>
-        <w:pStyle w:val="Compact"/>
-        <w:numPr>
-          <w:ilvl w:val="0"/>
-          <w:numId w:val="1014"/>
-        </w:numPr>
-      </w:pPr>
-      <w:r>
-        <w:t xml:space="preserve">Verify NSX-T VM IP assignments appear in InfoBlox On-Premises Network View within 60 seconds</w:t>
-      </w:r>
-    </w:p>
-    <w:bookmarkEnd w:id="129"/>
-    <w:bookmarkStart w:id="130" w:name="X77a697cf21d0ca41f2584ad67baf5270bd4b388"/>
-    <w:p>
-      <w:pPr>
-        <w:pStyle w:val="Heading3"/>
-      </w:pPr>
-      <w:r>
-        <w:t xml:space="preserve">Phase 3 — Azure Government Integration (Months 3–5)</w:t>
-      </w:r>
-    </w:p>
-    <w:p>
-      <w:pPr>
-        <w:pStyle w:val="Compact"/>
-        <w:numPr>
-          <w:ilvl w:val="0"/>
-          <w:numId w:val="1015"/>
-        </w:numPr>
-      </w:pPr>
-      <w:r>
-        <w:t xml:space="preserve">Deploy InfoBlox Grid Member as Azure VM in Hub VNet; configure Azure DNS Private Resolver to forward to Grid Member</w:t>
-      </w:r>
-    </w:p>
-    <w:p>
-      <w:pPr>
-        <w:pStyle w:val="Compact"/>
-        <w:numPr>
-          <w:ilvl w:val="0"/>
-          <w:numId w:val="1015"/>
-        </w:numPr>
-      </w:pPr>
-      <w:r>
-        <w:t xml:space="preserve">Register all Azure VNet/subnet CIDRs in InfoBlox Azure-GCC Network View; enable Azure connector</w:t>
-      </w:r>
-    </w:p>
-    <w:p>
-      <w:pPr>
-        <w:pStyle w:val="Compact"/>
-        <w:numPr>
-          <w:ilvl w:val="0"/>
-          <w:numId w:val="1015"/>
-        </w:numPr>
-      </w:pPr>
-      <w:r>
-        <w:t xml:space="preserve">Configure Azure Key Vault Certificate Manager polling in InfoBlox Certificate Tracker</w:t>
-      </w:r>
-    </w:p>
-    <w:p>
-      <w:pPr>
-        <w:pStyle w:val="Compact"/>
-        <w:numPr>
-          <w:ilvl w:val="0"/>
-          <w:numId w:val="1015"/>
-        </w:numPr>
-      </w:pPr>
-      <w:r>
-        <w:t xml:space="preserve">Configure M365 GCC endpoint API polling; test RPZ passthrough and commercial M365 RPZ block</w:t>
-      </w:r>
-    </w:p>
-    <w:bookmarkEnd w:id="130"/>
-    <w:bookmarkStart w:id="131" w:name="Xa43eec936343295a8326917a9cf352928776252"/>
-    <w:p>
-      <w:pPr>
-        <w:pStyle w:val="Heading3"/>
-      </w:pPr>
-      <w:r>
-        <w:t xml:space="preserve">Phase 4 — AWS GovCloud Integration (Months 5–7)</w:t>
       </w:r>
     </w:p>
     <w:p>
@@ -11105,7 +12384,7 @@
         </w:numPr>
       </w:pPr>
       <w:r>
-        <w:t xml:space="preserve">Deploy InfoBlox Grid Member as EC2 instance in Transit VPC</w:t>
+        <w:t xml:space="preserve">Deploy SCEP connector to ADCS; test automated cert enrollment from new IP host record</w:t>
       </w:r>
     </w:p>
     <w:p>
@@ -11117,53 +12396,17 @@
         </w:numPr>
       </w:pPr>
       <w:r>
-        <w:t xml:space="preserve">Update VPC DHCP Options Sets to use Grid Member IP as domain-name-server</w:t>
-      </w:r>
-    </w:p>
-    <w:p>
-      <w:pPr>
-        <w:pStyle w:val="Compact"/>
-        <w:numPr>
-          <w:ilvl w:val="0"/>
-          <w:numId w:val="1016"/>
-        </w:numPr>
-      </w:pPr>
-      <w:r>
-        <w:t xml:space="preserve">Enable InfoBlox AWS connector; register all VPC CIDR allocations in AWS-GovCloud Network View</w:t>
-      </w:r>
-    </w:p>
-    <w:p>
-      <w:pPr>
-        <w:pStyle w:val="Compact"/>
-        <w:numPr>
-          <w:ilvl w:val="0"/>
-          <w:numId w:val="1016"/>
-        </w:numPr>
-      </w:pPr>
-      <w:r>
-        <w:t xml:space="preserve">Configure ACM DNS validation CNAME automation; test certificate issuance for an internal ALB</w:t>
-      </w:r>
-    </w:p>
-    <w:p>
-      <w:pPr>
-        <w:pStyle w:val="Compact"/>
-        <w:numPr>
-          <w:ilvl w:val="0"/>
-          <w:numId w:val="1016"/>
-        </w:numPr>
-      </w:pPr>
-      <w:r>
-        <w:t xml:space="preserve">Integrate InfoBlox RPZ events with AWS Security Hub findings</w:t>
-      </w:r>
-    </w:p>
-    <w:bookmarkEnd w:id="131"/>
-    <w:bookmarkStart w:id="132" w:name="Xca1eadb88ebaa0b3ed62b98ccc9ae1a6edf20c4"/>
+        <w:t xml:space="preserve">Generate first CM-8 IP inventory export; reconcile against existing CMDB</w:t>
+      </w:r>
+    </w:p>
+    <w:bookmarkEnd w:id="145"/>
+    <w:bookmarkStart w:id="146" w:name="Xc4c0bc48ec731a428e8eb5363949c17466fc71f"/>
     <w:p>
       <w:pPr>
         <w:pStyle w:val="Heading3"/>
       </w:pPr>
       <w:r>
-        <w:t xml:space="preserve">Phase 5 — OCI OPM HRIT Integration (Months 7–9)</w:t>
+        <w:t xml:space="preserve">Phase 2 — VMware VCF 9.1 Integration (Months 2–4)</w:t>
       </w:r>
     </w:p>
     <w:p>
@@ -11175,7 +12418,7 @@
         </w:numPr>
       </w:pPr>
       <w:r>
-        <w:t xml:space="preserve">Import all known OPM HRIT service endpoint IPs and FQDNs as external host records</w:t>
+        <w:t xml:space="preserve">Update VCF to 9.1; configure VCF-A to use InfoBlox WAPI as external IPAM backend</w:t>
       </w:r>
     </w:p>
     <w:p>
@@ -11187,7 +12430,7 @@
         </w:numPr>
       </w:pPr>
       <w:r>
-        <w:t xml:space="preserve">Configure InfoBlox conditional forwarder for OPM HRIT FQDNs through FastConnect path</w:t>
+        <w:t xml:space="preserve">Update NSX-T DHCP Server Profiles to route DNS to InfoBlox Grid Member IP</w:t>
       </w:r>
     </w:p>
     <w:p>
@@ -11199,29 +12442,17 @@
         </w:numPr>
       </w:pPr>
       <w:r>
-        <w:t xml:space="preserve">Connect InfoBlox Certificate Tracker to OPM HRIT HTTPS endpoints; verify 90-day cert expiry alert fires</w:t>
-      </w:r>
-    </w:p>
-    <w:p>
-      <w:pPr>
-        <w:pStyle w:val="Compact"/>
-        <w:numPr>
-          <w:ilvl w:val="0"/>
-          <w:numId w:val="1017"/>
-        </w:numPr>
-      </w:pPr>
-      <w:r>
-        <w:t xml:space="preserve">Document OCI integration in SSP SA-9 external services table with OPM as system owner</w:t>
-      </w:r>
-    </w:p>
-    <w:bookmarkEnd w:id="132"/>
-    <w:bookmarkStart w:id="133" w:name="X6450109d4d09342385afb6f44eead155ff42378"/>
+        <w:t xml:space="preserve">Verify NSX-T VM IP assignments appear in InfoBlox On-Premises Network View within 60 seconds</w:t>
+      </w:r>
+    </w:p>
+    <w:bookmarkEnd w:id="146"/>
+    <w:bookmarkStart w:id="147" w:name="X77a697cf21d0ca41f2584ad67baf5270bd4b388"/>
     <w:p>
       <w:pPr>
         <w:pStyle w:val="Heading3"/>
       </w:pPr>
       <w:r>
-        <w:t xml:space="preserve">Phase 6 — FedRAMP Continuous Monitoring (Months 9–12)</w:t>
+        <w:t xml:space="preserve">Phase 3 — Azure Government Integration (Months 3–5)</w:t>
       </w:r>
     </w:p>
     <w:p>
@@ -11233,7 +12464,7 @@
         </w:numPr>
       </w:pPr>
       <w:r>
-        <w:t xml:space="preserve">Complete InfoBlox FedRAMP ATO documentation in SSP; reference CSO FR2017257053 for DDI layer control inheritance</w:t>
+        <w:t xml:space="preserve">Deploy InfoBlox Grid Member as Azure VM in Hub VNet; configure Azure DNS Private Resolver to forward to Grid Member</w:t>
       </w:r>
     </w:p>
     <w:p>
@@ -11245,7 +12476,7 @@
         </w:numPr>
       </w:pPr>
       <w:r>
-        <w:t xml:space="preserve">Configure all eight FedRAMP control evidence exports as scheduled reports</w:t>
+        <w:t xml:space="preserve">Register all Azure VNet/subnet CIDRs in InfoBlox Azure-GCC Network View; enable Azure connector</w:t>
       </w:r>
     </w:p>
     <w:p>
@@ -11257,7 +12488,7 @@
         </w:numPr>
       </w:pPr>
       <w:r>
-        <w:t xml:space="preserve">Implement IaC Terraform pipeline: IP allocation → DNS record → SCEP cert enrollment as single atomic pipeline</w:t>
+        <w:t xml:space="preserve">Configure Azure Key Vault Certificate Manager polling in InfoBlox Certificate Tracker</w:t>
       </w:r>
     </w:p>
     <w:p>
@@ -11269,6 +12500,192 @@
         </w:numPr>
       </w:pPr>
       <w:r>
+        <w:t xml:space="preserve">Configure M365 GCC endpoint API polling; test RPZ passthrough and commercial M365 RPZ block</w:t>
+      </w:r>
+    </w:p>
+    <w:bookmarkEnd w:id="147"/>
+    <w:bookmarkStart w:id="148" w:name="Xa43eec936343295a8326917a9cf352928776252"/>
+    <w:p>
+      <w:pPr>
+        <w:pStyle w:val="Heading3"/>
+      </w:pPr>
+      <w:r>
+        <w:t xml:space="preserve">Phase 4 — AWS GovCloud Integration (Months 5–7)</w:t>
+      </w:r>
+    </w:p>
+    <w:p>
+      <w:pPr>
+        <w:pStyle w:val="Compact"/>
+        <w:numPr>
+          <w:ilvl w:val="0"/>
+          <w:numId w:val="1019"/>
+        </w:numPr>
+      </w:pPr>
+      <w:r>
+        <w:t xml:space="preserve">Deploy InfoBlox Grid Member as EC2 instance in Transit VPC</w:t>
+      </w:r>
+    </w:p>
+    <w:p>
+      <w:pPr>
+        <w:pStyle w:val="Compact"/>
+        <w:numPr>
+          <w:ilvl w:val="0"/>
+          <w:numId w:val="1019"/>
+        </w:numPr>
+      </w:pPr>
+      <w:r>
+        <w:t xml:space="preserve">Update VPC DHCP Options Sets to use Grid Member IP as domain-name-server</w:t>
+      </w:r>
+    </w:p>
+    <w:p>
+      <w:pPr>
+        <w:pStyle w:val="Compact"/>
+        <w:numPr>
+          <w:ilvl w:val="0"/>
+          <w:numId w:val="1019"/>
+        </w:numPr>
+      </w:pPr>
+      <w:r>
+        <w:t xml:space="preserve">Enable InfoBlox AWS connector; register all VPC CIDR allocations in AWS-GovCloud Network View</w:t>
+      </w:r>
+    </w:p>
+    <w:p>
+      <w:pPr>
+        <w:pStyle w:val="Compact"/>
+        <w:numPr>
+          <w:ilvl w:val="0"/>
+          <w:numId w:val="1019"/>
+        </w:numPr>
+      </w:pPr>
+      <w:r>
+        <w:t xml:space="preserve">Configure ACM DNS validation CNAME automation; test certificate issuance for an internal ALB</w:t>
+      </w:r>
+    </w:p>
+    <w:p>
+      <w:pPr>
+        <w:pStyle w:val="Compact"/>
+        <w:numPr>
+          <w:ilvl w:val="0"/>
+          <w:numId w:val="1019"/>
+        </w:numPr>
+      </w:pPr>
+      <w:r>
+        <w:t xml:space="preserve">Integrate InfoBlox RPZ events with AWS Security Hub findings</w:t>
+      </w:r>
+    </w:p>
+    <w:bookmarkEnd w:id="148"/>
+    <w:bookmarkStart w:id="149" w:name="Xca1eadb88ebaa0b3ed62b98ccc9ae1a6edf20c4"/>
+    <w:p>
+      <w:pPr>
+        <w:pStyle w:val="Heading3"/>
+      </w:pPr>
+      <w:r>
+        <w:t xml:space="preserve">Phase 5 — OCI OPM HRIT Integration (Months 7–9)</w:t>
+      </w:r>
+    </w:p>
+    <w:p>
+      <w:pPr>
+        <w:pStyle w:val="Compact"/>
+        <w:numPr>
+          <w:ilvl w:val="0"/>
+          <w:numId w:val="1020"/>
+        </w:numPr>
+      </w:pPr>
+      <w:r>
+        <w:t xml:space="preserve">Import all known OPM HRIT service endpoint IPs and FQDNs as external host records</w:t>
+      </w:r>
+    </w:p>
+    <w:p>
+      <w:pPr>
+        <w:pStyle w:val="Compact"/>
+        <w:numPr>
+          <w:ilvl w:val="0"/>
+          <w:numId w:val="1020"/>
+        </w:numPr>
+      </w:pPr>
+      <w:r>
+        <w:t xml:space="preserve">Configure InfoBlox conditional forwarder for OPM HRIT FQDNs through FastConnect path</w:t>
+      </w:r>
+    </w:p>
+    <w:p>
+      <w:pPr>
+        <w:pStyle w:val="Compact"/>
+        <w:numPr>
+          <w:ilvl w:val="0"/>
+          <w:numId w:val="1020"/>
+        </w:numPr>
+      </w:pPr>
+      <w:r>
+        <w:t xml:space="preserve">Connect InfoBlox Certificate Tracker to OPM HRIT HTTPS endpoints; verify 90-day cert expiry alert fires</w:t>
+      </w:r>
+    </w:p>
+    <w:p>
+      <w:pPr>
+        <w:pStyle w:val="Compact"/>
+        <w:numPr>
+          <w:ilvl w:val="0"/>
+          <w:numId w:val="1020"/>
+        </w:numPr>
+      </w:pPr>
+      <w:r>
+        <w:t xml:space="preserve">Document OCI integration in SSP SA-9 external services table with OPM as system owner</w:t>
+      </w:r>
+    </w:p>
+    <w:bookmarkEnd w:id="149"/>
+    <w:bookmarkStart w:id="150" w:name="X6450109d4d09342385afb6f44eead155ff42378"/>
+    <w:p>
+      <w:pPr>
+        <w:pStyle w:val="Heading3"/>
+      </w:pPr>
+      <w:r>
+        <w:t xml:space="preserve">Phase 6 — FedRAMP Continuous Monitoring (Months 9–12)</w:t>
+      </w:r>
+    </w:p>
+    <w:p>
+      <w:pPr>
+        <w:pStyle w:val="Compact"/>
+        <w:numPr>
+          <w:ilvl w:val="0"/>
+          <w:numId w:val="1021"/>
+        </w:numPr>
+      </w:pPr>
+      <w:r>
+        <w:t xml:space="preserve">Complete InfoBlox FedRAMP ATO documentation in SSP; reference CSO FR2017257053 for DDI layer control inheritance</w:t>
+      </w:r>
+    </w:p>
+    <w:p>
+      <w:pPr>
+        <w:pStyle w:val="Compact"/>
+        <w:numPr>
+          <w:ilvl w:val="0"/>
+          <w:numId w:val="1021"/>
+        </w:numPr>
+      </w:pPr>
+      <w:r>
+        <w:t xml:space="preserve">Configure all eight FedRAMP control evidence exports as scheduled reports</w:t>
+      </w:r>
+    </w:p>
+    <w:p>
+      <w:pPr>
+        <w:pStyle w:val="Compact"/>
+        <w:numPr>
+          <w:ilvl w:val="0"/>
+          <w:numId w:val="1021"/>
+        </w:numPr>
+      </w:pPr>
+      <w:r>
+        <w:t xml:space="preserve">Implement IaC Terraform pipeline: IP allocation → DNS record → SCEP cert enrollment as single atomic pipeline</w:t>
+      </w:r>
+    </w:p>
+    <w:p>
+      <w:pPr>
+        <w:pStyle w:val="Compact"/>
+        <w:numPr>
+          <w:ilvl w:val="0"/>
+          <w:numId w:val="1021"/>
+        </w:numPr>
+      </w:pPr>
+      <w:r>
         <w:t xml:space="preserve">Configure FedRAMP 20x KSI automation checks (DNSSEC status, RPZ coverage, cert expiry, CIDR conflict) as CI/CD pipeline tests</w:t>
       </w:r>
     </w:p>
@@ -11279,9 +12696,9 @@
         </w:pict>
       </w:r>
     </w:p>
-    <w:bookmarkEnd w:id="133"/>
-    <w:bookmarkEnd w:id="134"/>
-    <w:bookmarkStart w:id="147" w:name="references"/>
+    <w:bookmarkEnd w:id="150"/>
+    <w:bookmarkEnd w:id="151"/>
+    <w:bookmarkStart w:id="164" w:name="references"/>
     <w:p>
       <w:pPr>
         <w:pStyle w:val="Heading2"/>
@@ -11355,7 +12772,7 @@
             <w:pPr>
               <w:pStyle w:val="Compact"/>
             </w:pPr>
-            <w:hyperlink r:id="rId135">
+            <w:hyperlink r:id="rId152">
               <w:r>
                 <w:rPr>
                   <w:rStyle w:val="Hyperlink"/>
@@ -11384,7 +12801,7 @@
             <w:pPr>
               <w:pStyle w:val="Compact"/>
             </w:pPr>
-            <w:hyperlink r:id="rId136">
+            <w:hyperlink r:id="rId153">
               <w:r>
                 <w:rPr>
                   <w:rStyle w:val="Hyperlink"/>
@@ -11413,7 +12830,7 @@
             <w:pPr>
               <w:pStyle w:val="Compact"/>
             </w:pPr>
-            <w:hyperlink r:id="rId137">
+            <w:hyperlink r:id="rId154">
               <w:r>
                 <w:rPr>
                   <w:rStyle w:val="Hyperlink"/>
@@ -11442,7 +12859,7 @@
             <w:pPr>
               <w:pStyle w:val="Compact"/>
             </w:pPr>
-            <w:hyperlink r:id="rId138">
+            <w:hyperlink r:id="rId155">
               <w:r>
                 <w:rPr>
                   <w:rStyle w:val="Hyperlink"/>
@@ -11471,7 +12888,7 @@
             <w:pPr>
               <w:pStyle w:val="Compact"/>
             </w:pPr>
-            <w:hyperlink r:id="rId139">
+            <w:hyperlink r:id="rId156">
               <w:r>
                 <w:rPr>
                   <w:rStyle w:val="Hyperlink"/>
@@ -11500,7 +12917,7 @@
             <w:pPr>
               <w:pStyle w:val="Compact"/>
             </w:pPr>
-            <w:hyperlink r:id="rId140">
+            <w:hyperlink r:id="rId157">
               <w:r>
                 <w:rPr>
                   <w:rStyle w:val="Hyperlink"/>
@@ -11529,7 +12946,7 @@
             <w:pPr>
               <w:pStyle w:val="Compact"/>
             </w:pPr>
-            <w:hyperlink r:id="rId141">
+            <w:hyperlink r:id="rId158">
               <w:r>
                 <w:rPr>
                   <w:rStyle w:val="Hyperlink"/>
@@ -11558,7 +12975,7 @@
             <w:pPr>
               <w:pStyle w:val="Compact"/>
             </w:pPr>
-            <w:hyperlink r:id="rId142">
+            <w:hyperlink r:id="rId159">
               <w:r>
                 <w:rPr>
                   <w:rStyle w:val="Hyperlink"/>
@@ -11587,7 +13004,7 @@
             <w:pPr>
               <w:pStyle w:val="Compact"/>
             </w:pPr>
-            <w:hyperlink r:id="rId143">
+            <w:hyperlink r:id="rId160">
               <w:r>
                 <w:rPr>
                   <w:rStyle w:val="Hyperlink"/>
@@ -11616,7 +13033,7 @@
             <w:pPr>
               <w:pStyle w:val="Compact"/>
             </w:pPr>
-            <w:hyperlink r:id="rId144">
+            <w:hyperlink r:id="rId161">
               <w:r>
                 <w:rPr>
                   <w:rStyle w:val="Hyperlink"/>
@@ -11645,7 +13062,7 @@
             <w:pPr>
               <w:pStyle w:val="Compact"/>
             </w:pPr>
-            <w:hyperlink r:id="rId145">
+            <w:hyperlink r:id="rId162">
               <w:r>
                 <w:rPr>
                   <w:rStyle w:val="Hyperlink"/>
@@ -11674,7 +13091,7 @@
             <w:pPr>
               <w:pStyle w:val="Compact"/>
             </w:pPr>
-            <w:hyperlink r:id="rId146">
+            <w:hyperlink r:id="rId163">
               <w:r>
                 <w:rPr>
                   <w:rStyle w:val="Hyperlink"/>
@@ -11693,7 +13110,7 @@
         </w:pict>
       </w:r>
     </w:p>
-    <w:bookmarkEnd w:id="147"/>
+    <w:bookmarkEnd w:id="164"/>
     <w:sectPr>
       <w:footnotePr>
         <w:numRestart w:val="eachSect"/>
@@ -12029,34 +13446,7 @@
     </w:lvlOverride>
   </w:num>
   <w:num w:numId="1003">
-    <w:abstractNumId w:val="99411"/>
-    <w:lvlOverride w:ilvl="0">
-      <w:startOverride w:val="1"/>
-    </w:lvlOverride>
-    <w:lvlOverride w:ilvl="1">
-      <w:startOverride w:val="1"/>
-    </w:lvlOverride>
-    <w:lvlOverride w:ilvl="2">
-      <w:startOverride w:val="1"/>
-    </w:lvlOverride>
-    <w:lvlOverride w:ilvl="3">
-      <w:startOverride w:val="1"/>
-    </w:lvlOverride>
-    <w:lvlOverride w:ilvl="4">
-      <w:startOverride w:val="1"/>
-    </w:lvlOverride>
-    <w:lvlOverride w:ilvl="5">
-      <w:startOverride w:val="1"/>
-    </w:lvlOverride>
-    <w:lvlOverride w:ilvl="6">
-      <w:startOverride w:val="1"/>
-    </w:lvlOverride>
-    <w:lvlOverride w:ilvl="7">
-      <w:startOverride w:val="1"/>
-    </w:lvlOverride>
-    <w:lvlOverride w:ilvl="8">
-      <w:startOverride w:val="1"/>
-    </w:lvlOverride>
+    <w:abstractNumId w:val="991"/>
   </w:num>
   <w:num w:numId="1004">
     <w:abstractNumId w:val="991"/>
@@ -12095,15 +13485,6 @@
     <w:abstractNumId w:val="991"/>
   </w:num>
   <w:num w:numId="1007">
-    <w:abstractNumId w:val="991"/>
-  </w:num>
-  <w:num w:numId="1008">
-    <w:abstractNumId w:val="991"/>
-  </w:num>
-  <w:num w:numId="1009">
-    <w:abstractNumId w:val="991"/>
-  </w:num>
-  <w:num w:numId="1010">
     <w:abstractNumId w:val="99411"/>
     <w:lvlOverride w:ilvl="0">
       <w:startOverride w:val="1"/>
@@ -12133,6 +13514,42 @@
       <w:startOverride w:val="1"/>
     </w:lvlOverride>
   </w:num>
+  <w:num w:numId="1008">
+    <w:abstractNumId w:val="99411"/>
+    <w:lvlOverride w:ilvl="0">
+      <w:startOverride w:val="1"/>
+    </w:lvlOverride>
+    <w:lvlOverride w:ilvl="1">
+      <w:startOverride w:val="1"/>
+    </w:lvlOverride>
+    <w:lvlOverride w:ilvl="2">
+      <w:startOverride w:val="1"/>
+    </w:lvlOverride>
+    <w:lvlOverride w:ilvl="3">
+      <w:startOverride w:val="1"/>
+    </w:lvlOverride>
+    <w:lvlOverride w:ilvl="4">
+      <w:startOverride w:val="1"/>
+    </w:lvlOverride>
+    <w:lvlOverride w:ilvl="5">
+      <w:startOverride w:val="1"/>
+    </w:lvlOverride>
+    <w:lvlOverride w:ilvl="6">
+      <w:startOverride w:val="1"/>
+    </w:lvlOverride>
+    <w:lvlOverride w:ilvl="7">
+      <w:startOverride w:val="1"/>
+    </w:lvlOverride>
+    <w:lvlOverride w:ilvl="8">
+      <w:startOverride w:val="1"/>
+    </w:lvlOverride>
+  </w:num>
+  <w:num w:numId="1009">
+    <w:abstractNumId w:val="991"/>
+  </w:num>
+  <w:num w:numId="1010">
+    <w:abstractNumId w:val="991"/>
+  </w:num>
   <w:num w:numId="1011">
     <w:abstractNumId w:val="991"/>
   </w:num>
@@ -12140,7 +13557,34 @@
     <w:abstractNumId w:val="991"/>
   </w:num>
   <w:num w:numId="1013">
-    <w:abstractNumId w:val="991"/>
+    <w:abstractNumId w:val="99411"/>
+    <w:lvlOverride w:ilvl="0">
+      <w:startOverride w:val="1"/>
+    </w:lvlOverride>
+    <w:lvlOverride w:ilvl="1">
+      <w:startOverride w:val="1"/>
+    </w:lvlOverride>
+    <w:lvlOverride w:ilvl="2">
+      <w:startOverride w:val="1"/>
+    </w:lvlOverride>
+    <w:lvlOverride w:ilvl="3">
+      <w:startOverride w:val="1"/>
+    </w:lvlOverride>
+    <w:lvlOverride w:ilvl="4">
+      <w:startOverride w:val="1"/>
+    </w:lvlOverride>
+    <w:lvlOverride w:ilvl="5">
+      <w:startOverride w:val="1"/>
+    </w:lvlOverride>
+    <w:lvlOverride w:ilvl="6">
+      <w:startOverride w:val="1"/>
+    </w:lvlOverride>
+    <w:lvlOverride w:ilvl="7">
+      <w:startOverride w:val="1"/>
+    </w:lvlOverride>
+    <w:lvlOverride w:ilvl="8">
+      <w:startOverride w:val="1"/>
+    </w:lvlOverride>
   </w:num>
   <w:num w:numId="1014">
     <w:abstractNumId w:val="991"/>
@@ -12155,6 +13599,15 @@
     <w:abstractNumId w:val="991"/>
   </w:num>
   <w:num w:numId="1018">
+    <w:abstractNumId w:val="991"/>
+  </w:num>
+  <w:num w:numId="1019">
+    <w:abstractNumId w:val="991"/>
+  </w:num>
+  <w:num w:numId="1020">
+    <w:abstractNumId w:val="991"/>
+  </w:num>
+  <w:num w:numId="1021">
     <w:abstractNumId w:val="991"/>
   </w:num>
 </w:numbering>

</xml_diff>